<commit_message>
feat(branding): update author and audit verification profile to Mr. Jayant Patil Founder & CEO across all audits
</commit_message>
<xml_diff>
--- a/The-Great-Study-Abroad-Shift-2026-FINAL.docx
+++ b/The-Great-Study-Abroad-Shift-2026-FINAL.docx
@@ -1,6 +1,6 @@
 
 <file path=word/document.xml><?xml version="1.0" encoding="utf-8"?>
-<w:document xmlns:w="http://schemas.openxmlformats.org/wordprocessingml/2006/main">
+<w:document xmlns:wpc="http://schemas.microsoft.com/office/word/2010/wordprocessingCanvas" xmlns:cx="http://schemas.microsoft.com/office/drawing/2014/chartex" xmlns:cx1="http://schemas.microsoft.com/office/drawing/2015/9/8/chartex" xmlns:cx2="http://schemas.microsoft.com/office/drawing/2015/10/21/chartex" xmlns:cx3="http://schemas.microsoft.com/office/drawing/2016/5/9/chartex" xmlns:cx4="http://schemas.microsoft.com/office/drawing/2016/5/10/chartex" xmlns:cx5="http://schemas.microsoft.com/office/drawing/2016/5/11/chartex" xmlns:cx6="http://schemas.microsoft.com/office/drawing/2016/5/12/chartex" xmlns:cx7="http://schemas.microsoft.com/office/drawing/2016/5/13/chartex" xmlns:cx8="http://schemas.microsoft.com/office/drawing/2016/5/14/chartex" xmlns:mc="http://schemas.openxmlformats.org/markup-compatibility/2006" xmlns:aink="http://schemas.microsoft.com/office/drawing/2016/ink" xmlns:am3d="http://schemas.microsoft.com/office/drawing/2017/model3d" xmlns:o="urn:schemas-microsoft-com:office:office" xmlns:oel="http://schemas.microsoft.com/office/2019/extlst" xmlns:r="http://schemas.openxmlformats.org/officeDocument/2006/relationships" xmlns:m="http://schemas.openxmlformats.org/officeDocument/2006/math" xmlns:v="urn:schemas-microsoft-com:vml" xmlns:wp14="http://schemas.microsoft.com/office/word/2010/wordprocessingDrawing" xmlns:wp="http://schemas.openxmlformats.org/drawingml/2006/wordprocessingDrawing" xmlns:w10="urn:schemas-microsoft-com:office:word" xmlns:w="http://schemas.openxmlformats.org/wordprocessingml/2006/main" xmlns:w14="http://schemas.microsoft.com/office/word/2010/wordml" xmlns:w15="http://schemas.microsoft.com/office/word/2012/wordml" xmlns:w16cex="http://schemas.microsoft.com/office/word/2018/wordml/cex" xmlns:w16cid="http://schemas.microsoft.com/office/word/2016/wordml/cid" xmlns:w16="http://schemas.microsoft.com/office/word/2018/wordml" xmlns:w16du="http://schemas.microsoft.com/office/word/2023/wordml/word16du" xmlns:w16sdtdh="http://schemas.microsoft.com/office/word/2020/wordml/sdtdatahash" xmlns:w16sdtfl="http://schemas.microsoft.com/office/word/2024/wordml/sdtformatlock" xmlns:w16se="http://schemas.microsoft.com/office/word/2015/wordml/symex" xmlns:wpg="http://schemas.microsoft.com/office/word/2010/wordprocessingGroup" xmlns:wpi="http://schemas.microsoft.com/office/word/2010/wordprocessingInk" xmlns:wne="http://schemas.microsoft.com/office/word/2006/wordml" xmlns:wps="http://schemas.microsoft.com/office/word/2010/wordprocessingShape" mc:Ignorable="w14 w15 w16se w16cid w16 w16cex w16sdtdh w16sdtfl w16du wp14">
   <w:body>
     <w:p>
       <w:pPr>
@@ -13,8 +13,8 @@
     <w:p>
       <w:r>
         <w:rPr>
+          <w:b/>
           <w:i/>
-          <w:b/>
           <w:color w:val="0D9488"/>
         </w:rPr>
         <w:t>FINESSE OVERSEAS EDUCATION • STRATEGIC RESEARCH WHITE-PAPER</w:t>
@@ -23,8 +23,8 @@
     <w:p>
       <w:r>
         <w:rPr>
+          <w:color w:val="64748B"/>
           <w:sz w:val="18"/>
-          <w:color w:val="64748B"/>
         </w:rPr>
         <w:t>Authors: Rohit Kasture (Senior Placement Strategist) • Jayant Patil (Director, Alumni VJTI &amp; JBIMS)</w:t>
       </w:r>
@@ -67,7 +67,7 @@
           <w:b/>
           <w:color w:val="0D9488"/>
         </w:rPr>
-        <w:t>✓ </w:t>
+        <w:t>✓</w:t>
       </w:r>
       <w:r>
         <w:t>The Fallacy of Market Contraction: The perceived "study abroad slowdown" is not a drop in student ambition, but the statutory dismantling of predatory private diploma mills in Canada and the UK that traded immigration speculation for subprime tuition fees.</w:t>
@@ -82,7 +82,7 @@
           <w:b/>
           <w:color w:val="0D9488"/>
         </w:rPr>
-        <w:t>✓ </w:t>
+        <w:t>✓</w:t>
       </w:r>
       <w:r>
         <w:t>The Mathematical Ruin Problem: Servicing a ₹50,00,000 unsecured education loan at 13.5% interest requires ₹76,100 per month for 120 months—a repayment liability of ₹91,32,000 that domestic Indian salaries cannot absorb if international sponsorship fails.</w:t>
@@ -97,7 +97,7 @@
           <w:b/>
           <w:color w:val="0D9488"/>
         </w:rPr>
-        <w:t>✓ </w:t>
+        <w:t>✓</w:t>
       </w:r>
       <w:r>
         <w:t>The Sovereign European Arbitrage: Germany provides 100% tuition-free public higher education backed by the Skilled Immigration Act and 18-month post-study work authorization, while Italy guarantees statutory 100% tuition fee waivers plus direct annual living stipends of €7,000 to €8,500 under Constitutional Article 34.</w:t>
@@ -128,7 +128,15 @@
     </w:p>
     <w:p>
       <w:r>
-        <w:t>For the past decade, the Anglo-Saxon higher education market operated on a commodified "paper-mill arbitrage." Private vocational colleges in Ontario, British Columbia, and regional UK cities functioned essentially as visa brokers. They extracted high-margin international tuition from middle-class Indian families by selling the speculative promise of post-study work permits and eventual permanent residency (PR), despite offering near-zero academic signaling value.</w:t>
+        <w:t xml:space="preserve">For the past decade, the Anglo-Saxon higher education market operated on a commodified "paper-mill arbitrage." Private vocational colleges in Ontario, British Columbia, and regional UK cities functioned essentially as visa brokers. They extracted high-margin international tuition from middle-class Indian families by selling the speculative promise of post-study work permits and eventual permanent residency (PR), despite offering near-zero academic </w:t>
+      </w:r>
+      <w:proofErr w:type="spellStart"/>
+      <w:r>
+        <w:t>signaling</w:t>
+      </w:r>
+      <w:proofErr w:type="spellEnd"/>
+      <w:r>
+        <w:t xml:space="preserve"> value.</w:t>
       </w:r>
     </w:p>
     <w:p>
@@ -148,10 +156,34 @@
           <w:b/>
           <w:color w:val="0D9488"/>
         </w:rPr>
-        <w:t>✓ </w:t>
-      </w:r>
-      <w:r>
-        <w:t>The Traditional Commercial Model (Pre-2024): High-Interest Private Debt (₹50L–₹70L) $\rightarrow$ Unranked Strip-Mall College $\rightarrow$ PR Speculation $\rightarrow$ Regulatory Crackdown &amp; Financial Trap.</w:t>
+        <w:t>✓</w:t>
+      </w:r>
+      <w:r>
+        <w:t>The Traditional Commercial Model (Pre-2024): High-Interest Private Debt (₹50L–₹70L) $\</w:t>
+      </w:r>
+      <w:proofErr w:type="spellStart"/>
+      <w:r>
+        <w:t>rightarrow</w:t>
+      </w:r>
+      <w:proofErr w:type="spellEnd"/>
+      <w:r>
+        <w:t>$ Unranked Strip-Mall College $\</w:t>
+      </w:r>
+      <w:proofErr w:type="spellStart"/>
+      <w:r>
+        <w:t>rightarrow</w:t>
+      </w:r>
+      <w:proofErr w:type="spellEnd"/>
+      <w:r>
+        <w:t>$ PR Speculation $\</w:t>
+      </w:r>
+      <w:proofErr w:type="spellStart"/>
+      <w:r>
+        <w:t>rightarrow</w:t>
+      </w:r>
+      <w:proofErr w:type="spellEnd"/>
+      <w:r>
+        <w:t>$ Regulatory Crackdown &amp; Financial Trap.</w:t>
       </w:r>
     </w:p>
     <w:p>
@@ -163,15 +195,48 @@
           <w:b/>
           <w:color w:val="0D9488"/>
         </w:rPr>
-        <w:t>✓ </w:t>
-      </w:r>
-      <w:r>
-        <w:t>The Sovereign Realignment (2025–2026): Zero Debt / State Subsidies $\rightarrow$ 500-Year-Old Public Research University (TUM / Bologna) $\rightarrow$ High-Demand STEM/Management Discipline $\rightarrow$ Permanent Sovereign Stability.</w:t>
-      </w:r>
-    </w:p>
-    <w:p>
-      <w:r>
-        <w:t>In 2026, regulatory saturation has brought this debt-fueled speculative cycle to a grinding halt. Outbound Indian students have not stopped pursuing global education; rather, they have rationalized their risk profiles. The market has permanently pivoted from speculative commercial diploma mills to sovereign-subsidized, merit-filtered public universities across Continental Europe.</w:t>
+        <w:lastRenderedPageBreak/>
+        <w:t>✓</w:t>
+      </w:r>
+      <w:r>
+        <w:t>The Sovereign Realignment (2025–2026): Zero Debt / State Subsidies $\</w:t>
+      </w:r>
+      <w:proofErr w:type="spellStart"/>
+      <w:r>
+        <w:t>rightarrow</w:t>
+      </w:r>
+      <w:proofErr w:type="spellEnd"/>
+      <w:r>
+        <w:t>$ 500-Year-Old Public Research University (TUM / Bologna) $\</w:t>
+      </w:r>
+      <w:proofErr w:type="spellStart"/>
+      <w:r>
+        <w:t>rightarrow</w:t>
+      </w:r>
+      <w:proofErr w:type="spellEnd"/>
+      <w:r>
+        <w:t>$ High-Demand STEM/Management Discipline $\</w:t>
+      </w:r>
+      <w:proofErr w:type="spellStart"/>
+      <w:r>
+        <w:t>rightarrow</w:t>
+      </w:r>
+      <w:proofErr w:type="spellEnd"/>
+      <w:r>
+        <w:t>$ Permanent Sovereign Stability.</w:t>
+      </w:r>
+    </w:p>
+    <w:p>
+      <w:r>
+        <w:t>In 2026, regulatory saturation has brought this debt-</w:t>
+      </w:r>
+      <w:proofErr w:type="spellStart"/>
+      <w:r>
+        <w:t>fueled</w:t>
+      </w:r>
+      <w:proofErr w:type="spellEnd"/>
+      <w:r>
+        <w:t xml:space="preserve"> speculative cycle to a grinding halt. Outbound Indian students have not stopped pursuing global education; rather, they have rationalized their risk profiles. The market has permanently pivoted from speculative commercial diploma mills to sovereign-subsidized, merit-filtered public universities across Continental Europe.</w:t>
       </w:r>
     </w:p>
     <w:p>
@@ -189,7 +254,15 @@
     </w:p>
     <w:p>
       <w:r>
-        <w:t>For over a decade, Canada served as the primary destination for volume-driven education agencies. However, the unchecked influx of temporary residents created acute domestic strains on housing inventories, healthcare infrastructure, and entry-level labor markets. In response, Immigration, Refugees and Citizenship Canada (IRCC) enacted aggressive statutory interventions:</w:t>
+        <w:t xml:space="preserve">For over a decade, Canada served as the primary destination for volume-driven education agencies. However, the unchecked influx of temporary residents created acute domestic strains on housing inventories, healthcare infrastructure, and entry-level </w:t>
+      </w:r>
+      <w:proofErr w:type="spellStart"/>
+      <w:r>
+        <w:t>labor</w:t>
+      </w:r>
+      <w:proofErr w:type="spellEnd"/>
+      <w:r>
+        <w:t xml:space="preserve"> markets. In response, Immigration, Refugees and Citizenship Canada (IRCC) enacted aggressive statutory interventions:</w:t>
       </w:r>
     </w:p>
     <w:p>
@@ -236,12 +309,20 @@
         <w:pStyle w:val="Heading2"/>
       </w:pPr>
       <w:r>
-        <w:t>📊 Empirical Impact</w:t>
-      </w:r>
-    </w:p>
-    <w:p>
-      <w:r>
-        <w:t>According to official IRCC data, new study permit applications from India have plummeted by more than 50%. Graduating students who accumulated tens of lakhs in private debt now face an oversaturated low-skill labor market, restricted work authorization, and an immigration points threshold (Comprehensive Ranking System - CRS) that renders PR transition mathematically impossible for non-specialized diploma holders. The Canadian "shortcut diploma trap" has reached regulatory exhaustion.</w:t>
+        <w:t xml:space="preserve"> Empirical Impact</w:t>
+      </w:r>
+    </w:p>
+    <w:p>
+      <w:r>
+        <w:t xml:space="preserve">According to official IRCC data, new study permit applications from India have plummeted by more than 50%. Graduating students who accumulated tens of lakhs in private debt now face an oversaturated low-skill </w:t>
+      </w:r>
+      <w:proofErr w:type="spellStart"/>
+      <w:r>
+        <w:t>labor</w:t>
+      </w:r>
+      <w:proofErr w:type="spellEnd"/>
+      <w:r>
+        <w:t xml:space="preserve"> market, restricted work authorization, and an immigration points threshold (Comprehensive Ranking System - CRS) that renders PR transition mathematically impossible for non-specialized diploma holders. The Canadian "shortcut diploma trap" has reached regulatory exhaustion.</w:t>
       </w:r>
     </w:p>
     <w:p>
@@ -259,7 +340,11 @@
     </w:p>
     <w:p>
       <w:r>
-        <w:t>The United Kingdom aggressively positioned its one-year taught master’s (MSc/MA) programs as expedited, cost-effective bridges to international corporate mobility. However, consecutive policy revisions enacted by the UK Home Office (Statement of Changes in Immigration Rules - HC 590) have broken the return-on-investment calculus:</w:t>
+        <w:t xml:space="preserve">The United Kingdom aggressively positioned its one-year taught master’s (MSc/MA) programs as expedited, cost-effective bridges to international corporate mobility. However, consecutive policy revisions enacted by </w:t>
+      </w:r>
+      <w:r>
+        <w:lastRenderedPageBreak/>
+        <w:t>the UK Home Office (Statement of Changes in Immigration Rules - HC 590) have broken the return-on-investment calculus:</w:t>
       </w:r>
     </w:p>
     <w:p>
@@ -293,7 +378,7 @@
         <w:pStyle w:val="Heading2"/>
       </w:pPr>
       <w:r>
-        <w:t>📉 UK Wage Gap &amp; Sponsorship Deficit Matrix</w:t>
+        <w:t xml:space="preserve"> UK Wage Gap &amp; Sponsorship Deficit Matrix</w:t>
       </w:r>
     </w:p>
     <w:p>
@@ -301,14 +386,31 @@
         <w:pStyle w:val="Heading2"/>
       </w:pPr>
       <w:r>
-        <w:t>📊 Empirical Impact</w:t>
+        <w:t xml:space="preserve"> Empirical Impact</w:t>
       </w:r>
     </w:p>
     <w:tbl>
       <w:tblPr>
         <w:tblW w:w="9000" w:type="dxa"/>
+        <w:tblInd w:w="10" w:type="dxa"/>
+        <w:tblCellMar>
+          <w:left w:w="10" w:type="dxa"/>
+          <w:right w:w="10" w:type="dxa"/>
+        </w:tblCellMar>
+        <w:tblLook w:val="04A0" w:firstRow="1" w:lastRow="0" w:firstColumn="1" w:lastColumn="0" w:noHBand="0" w:noVBand="1"/>
       </w:tblPr>
+      <w:tblGrid>
+        <w:gridCol w:w="3029"/>
+        <w:gridCol w:w="2905"/>
+        <w:gridCol w:w="3066"/>
+      </w:tblGrid>
       <w:tr>
+        <w:tblPrEx>
+          <w:tblCellMar>
+            <w:top w:w="0" w:type="dxa"/>
+            <w:bottom w:w="0" w:type="dxa"/>
+          </w:tblCellMar>
+        </w:tblPrEx>
         <w:tc>
           <w:tcPr>
             <w:tcW w:w="4500" w:type="dxa"/>
@@ -374,22 +476,25 @@
         </w:tc>
       </w:tr>
       <w:tr>
-        <w:tc>
-          <w:tcPr>
-            <w:tcW w:w="4500" w:type="dxa"/>
-            <w:tcBorders>
-              <w:top w:val="single" w:sz="4" w:space="0" w:color="CBD5E1"/>
-              <w:left w:val="single" w:sz="4" w:space="0" w:color="CBD5E1"/>
-              <w:bottom w:val="single" w:sz="4" w:space="0" w:color="CBD5E1"/>
-              <w:right w:val="single" w:sz="4" w:space="0" w:color="CBD5E1"/>
-            </w:tcBorders>
-            <w:shd w:val="clear" w:color="auto" w:fill="FFFFFF"/>
-          </w:tcPr>
-          <w:p>
-            <w:r>
-              <w:rPr>
-                <w:color w:val="1E293B"/>
-              </w:rPr>
+        <w:tblPrEx>
+          <w:tblCellMar>
+            <w:top w:w="0" w:type="dxa"/>
+            <w:bottom w:w="0" w:type="dxa"/>
+          </w:tblCellMar>
+        </w:tblPrEx>
+        <w:tc>
+          <w:tcPr>
+            <w:tcW w:w="4500" w:type="dxa"/>
+            <w:tcBorders>
+              <w:top w:val="single" w:sz="4" w:space="0" w:color="CBD5E1"/>
+              <w:left w:val="single" w:sz="4" w:space="0" w:color="CBD5E1"/>
+              <w:bottom w:val="single" w:sz="4" w:space="0" w:color="CBD5E1"/>
+              <w:right w:val="single" w:sz="4" w:space="0" w:color="CBD5E1"/>
+            </w:tcBorders>
+            <w:shd w:val="clear" w:color="auto" w:fill="FFFFFF"/>
+          </w:tcPr>
+          <w:p>
+            <w:r>
               <w:t>Average Entry-Level Master's Salary in UK</w:t>
             </w:r>
           </w:p>
@@ -407,9 +512,6 @@
           </w:tcPr>
           <w:p>
             <w:r>
-              <w:rPr>
-                <w:color w:val="1E293B"/>
-              </w:rPr>
               <w:t>£28,000 – £32,000 / year (~₹30L–₹35L)</w:t>
             </w:r>
           </w:p>
@@ -427,31 +529,31 @@
           </w:tcPr>
           <w:p>
             <w:r>
-              <w:rPr>
-                <w:color w:val="1E293B"/>
-              </w:rPr>
               <w:t>Standard regional corporate hiring offer</w:t>
             </w:r>
           </w:p>
         </w:tc>
       </w:tr>
       <w:tr>
-        <w:tc>
-          <w:tcPr>
-            <w:tcW w:w="4500" w:type="dxa"/>
-            <w:tcBorders>
-              <w:top w:val="single" w:sz="4" w:space="0" w:color="CBD5E1"/>
-              <w:left w:val="single" w:sz="4" w:space="0" w:color="CBD5E1"/>
-              <w:bottom w:val="single" w:sz="4" w:space="0" w:color="CBD5E1"/>
-              <w:right w:val="single" w:sz="4" w:space="0" w:color="CBD5E1"/>
-            </w:tcBorders>
-            <w:shd w:val="clear" w:color="auto" w:fill="FFFFFF"/>
-          </w:tcPr>
-          <w:p>
-            <w:r>
-              <w:rPr>
-                <w:color w:val="1E293B"/>
-              </w:rPr>
+        <w:tblPrEx>
+          <w:tblCellMar>
+            <w:top w:w="0" w:type="dxa"/>
+            <w:bottom w:w="0" w:type="dxa"/>
+          </w:tblCellMar>
+        </w:tblPrEx>
+        <w:tc>
+          <w:tcPr>
+            <w:tcW w:w="4500" w:type="dxa"/>
+            <w:tcBorders>
+              <w:top w:val="single" w:sz="4" w:space="0" w:color="CBD5E1"/>
+              <w:left w:val="single" w:sz="4" w:space="0" w:color="CBD5E1"/>
+              <w:bottom w:val="single" w:sz="4" w:space="0" w:color="CBD5E1"/>
+              <w:right w:val="single" w:sz="4" w:space="0" w:color="CBD5E1"/>
+            </w:tcBorders>
+            <w:shd w:val="clear" w:color="auto" w:fill="FFFFFF"/>
+          </w:tcPr>
+          <w:p>
+            <w:r>
               <w:t>Statutory Home Office Sponsorship Floor</w:t>
             </w:r>
           </w:p>
@@ -469,9 +571,6 @@
           </w:tcPr>
           <w:p>
             <w:r>
-              <w:rPr>
-                <w:color w:val="1E293B"/>
-              </w:rPr>
               <w:t>£38,700 / year (~₹42.5 Lakhs INR)</w:t>
             </w:r>
           </w:p>
@@ -489,31 +588,31 @@
           </w:tcPr>
           <w:p>
             <w:r>
-              <w:rPr>
-                <w:color w:val="1E293B"/>
-              </w:rPr>
               <w:t>Mandatory threshold for Skilled Worker Visa</w:t>
             </w:r>
           </w:p>
         </w:tc>
       </w:tr>
       <w:tr>
-        <w:tc>
-          <w:tcPr>
-            <w:tcW w:w="4500" w:type="dxa"/>
-            <w:tcBorders>
-              <w:top w:val="single" w:sz="4" w:space="0" w:color="CBD5E1"/>
-              <w:left w:val="single" w:sz="4" w:space="0" w:color="CBD5E1"/>
-              <w:bottom w:val="single" w:sz="4" w:space="0" w:color="CBD5E1"/>
-              <w:right w:val="single" w:sz="4" w:space="0" w:color="CBD5E1"/>
-            </w:tcBorders>
-            <w:shd w:val="clear" w:color="auto" w:fill="FFFFFF"/>
-          </w:tcPr>
-          <w:p>
-            <w:r>
-              <w:rPr>
-                <w:color w:val="1E293B"/>
-              </w:rPr>
+        <w:tblPrEx>
+          <w:tblCellMar>
+            <w:top w:w="0" w:type="dxa"/>
+            <w:bottom w:w="0" w:type="dxa"/>
+          </w:tblCellMar>
+        </w:tblPrEx>
+        <w:tc>
+          <w:tcPr>
+            <w:tcW w:w="4500" w:type="dxa"/>
+            <w:tcBorders>
+              <w:top w:val="single" w:sz="4" w:space="0" w:color="CBD5E1"/>
+              <w:left w:val="single" w:sz="4" w:space="0" w:color="CBD5E1"/>
+              <w:bottom w:val="single" w:sz="4" w:space="0" w:color="CBD5E1"/>
+              <w:right w:val="single" w:sz="4" w:space="0" w:color="CBD5E1"/>
+            </w:tcBorders>
+            <w:shd w:val="clear" w:color="auto" w:fill="FFFFFF"/>
+          </w:tcPr>
+          <w:p>
+            <w:r>
               <w:t>The Sponsorship Deficit Gap</w:t>
             </w:r>
           </w:p>
@@ -531,9 +630,6 @@
           </w:tcPr>
           <w:p>
             <w:r>
-              <w:rPr>
-                <w:color w:val="1E293B"/>
-              </w:rPr>
               <w:t>£6,700 to £10,700 Shortfall</w:t>
             </w:r>
           </w:p>
@@ -551,9 +647,6 @@
           </w:tcPr>
           <w:p>
             <w:r>
-              <w:rPr>
-                <w:color w:val="1E293B"/>
-              </w:rPr>
               <w:t>Sponsorship Denied (Forced Repatriation)</w:t>
             </w:r>
           </w:p>
@@ -561,8 +654,13 @@
       </w:tr>
     </w:tbl>
     <w:p>
-      <w:r>
-        <w:t>The vast majority of UK regional enterprises cannot justify entry-level compensation packages exceeding £38,700 for fresh graduates lacking prior European managerial tenure. As a direct consequence, over 85% to 90% of Indian master's graduates are forced to repatriate upon Graduate Route expiration. Incurring ₹35 to ₹45 Lakhs in debt for a single-year credential without employer sponsorship is a statistically flawed proposition.</w:t>
+      <w:proofErr w:type="gramStart"/>
+      <w:r>
+        <w:t>The vast majority of</w:t>
+      </w:r>
+      <w:proofErr w:type="gramEnd"/>
+      <w:r>
+        <w:t xml:space="preserve"> UK regional enterprises cannot justify entry-level compensation packages exceeding £38,700 for fresh graduates lacking prior European managerial tenure. As a direct consequence, over 85% to 90% of Indian master's graduates are forced to repatriate upon Graduate Route expiration. Incurring ₹35 to ₹45 Lakhs in debt for a single-year credential without employer sponsorship is a statistically flawed proposition.</w:t>
       </w:r>
     </w:p>
     <w:p>
@@ -575,12 +673,28 @@
         <w:pStyle w:val="Heading1"/>
       </w:pPr>
       <w:r>
-        <w:t>4. The Mathematics of the ₹50-Lakh Unsecured Debt Trap: The Ruin Problem</w:t>
-      </w:r>
-    </w:p>
-    <w:p>
-      <w:r>
-        <w:t>In behavioral finance, the "Ruin Problem" describes a scenario where an adverse sequence of events permanently depletes an individual's capital base, preventing recovery. When Indian middle-class households secure high-interest, non-collateralized loans from Non-Banking Financial Companies (NBFCs) to finance commercial degrees, they enter this exact mathematical condition.</w:t>
+        <w:t xml:space="preserve">4. The </w:t>
+      </w:r>
+      <w:proofErr w:type="gramStart"/>
+      <w:r>
+        <w:t>Mathematics</w:t>
+      </w:r>
+      <w:proofErr w:type="gramEnd"/>
+      <w:r>
+        <w:t xml:space="preserve"> of the ₹50-Lakh Unsecured Debt Trap: The Ruin Problem</w:t>
+      </w:r>
+    </w:p>
+    <w:p>
+      <w:r>
+        <w:t xml:space="preserve">In </w:t>
+      </w:r>
+      <w:proofErr w:type="spellStart"/>
+      <w:r>
+        <w:t>behavioral</w:t>
+      </w:r>
+      <w:proofErr w:type="spellEnd"/>
+      <w:r>
+        <w:t xml:space="preserve"> finance, the "Ruin Problem" describes a scenario where an adverse sequence of events permanently depletes an individual's capital base, preventing recovery. When Indian middle-class households secure high-interest, non-collateralized loans from Non-Banking Financial Companies (NBFCs) to finance commercial degrees, they enter this exact mathematical condition.</w:t>
       </w:r>
     </w:p>
     <w:p>
@@ -588,7 +702,7 @@
         <w:pStyle w:val="Heading2"/>
       </w:pPr>
       <w:r>
-        <w:t>🧮 Quantitative Amortization Model: ₹50 Lakh Private Loan</w:t>
+        <w:t xml:space="preserve"> Quantitative Amortization Model: ₹50 Lakh Private Loan</w:t>
       </w:r>
     </w:p>
     <w:p>
@@ -600,15 +714,42 @@
       <w:pPr>
         <w:pStyle w:val="Heading2"/>
       </w:pPr>
-      <w:r>
+    </w:p>
+    <w:p>
+      <w:pPr>
+        <w:pStyle w:val="Heading2"/>
+      </w:pPr>
+    </w:p>
+    <w:p>
+      <w:pPr>
+        <w:pStyle w:val="Heading2"/>
+      </w:pPr>
+      <w:r>
+        <w:lastRenderedPageBreak/>
         <w:t>The Downside Distribution &amp; Balance-Sheet Exposure</w:t>
       </w:r>
     </w:p>
     <w:tbl>
       <w:tblPr>
         <w:tblW w:w="9000" w:type="dxa"/>
+        <w:tblInd w:w="10" w:type="dxa"/>
+        <w:tblCellMar>
+          <w:left w:w="10" w:type="dxa"/>
+          <w:right w:w="10" w:type="dxa"/>
+        </w:tblCellMar>
+        <w:tblLook w:val="04A0" w:firstRow="1" w:lastRow="0" w:firstColumn="1" w:lastColumn="0" w:noHBand="0" w:noVBand="1"/>
       </w:tblPr>
+      <w:tblGrid>
+        <w:gridCol w:w="4500"/>
+        <w:gridCol w:w="4500"/>
+      </w:tblGrid>
       <w:tr>
+        <w:tblPrEx>
+          <w:tblCellMar>
+            <w:top w:w="0" w:type="dxa"/>
+            <w:bottom w:w="0" w:type="dxa"/>
+          </w:tblCellMar>
+        </w:tblPrEx>
         <w:tc>
           <w:tcPr>
             <w:tcW w:w="4500" w:type="dxa"/>
@@ -653,22 +794,25 @@
         </w:tc>
       </w:tr>
       <w:tr>
-        <w:tc>
-          <w:tcPr>
-            <w:tcW w:w="4500" w:type="dxa"/>
-            <w:tcBorders>
-              <w:top w:val="single" w:sz="4" w:space="0" w:color="CBD5E1"/>
-              <w:left w:val="single" w:sz="4" w:space="0" w:color="CBD5E1"/>
-              <w:bottom w:val="single" w:sz="4" w:space="0" w:color="CBD5E1"/>
-              <w:right w:val="single" w:sz="4" w:space="0" w:color="CBD5E1"/>
-            </w:tcBorders>
-            <w:shd w:val="clear" w:color="auto" w:fill="FFFFFF"/>
-          </w:tcPr>
-          <w:p>
-            <w:r>
-              <w:rPr>
-                <w:color w:val="1E293B"/>
-              </w:rPr>
+        <w:tblPrEx>
+          <w:tblCellMar>
+            <w:top w:w="0" w:type="dxa"/>
+            <w:bottom w:w="0" w:type="dxa"/>
+          </w:tblCellMar>
+        </w:tblPrEx>
+        <w:tc>
+          <w:tcPr>
+            <w:tcW w:w="4500" w:type="dxa"/>
+            <w:tcBorders>
+              <w:top w:val="single" w:sz="4" w:space="0" w:color="CBD5E1"/>
+              <w:left w:val="single" w:sz="4" w:space="0" w:color="CBD5E1"/>
+              <w:bottom w:val="single" w:sz="4" w:space="0" w:color="CBD5E1"/>
+              <w:right w:val="single" w:sz="4" w:space="0" w:color="CBD5E1"/>
+            </w:tcBorders>
+            <w:shd w:val="clear" w:color="auto" w:fill="FFFFFF"/>
+          </w:tcPr>
+          <w:p>
+            <w:r>
               <w:t>Principal Loan Amount ($P$)</w:t>
             </w:r>
           </w:p>
@@ -686,31 +830,31 @@
           </w:tcPr>
           <w:p>
             <w:r>
-              <w:rPr>
-                <w:color w:val="1E293B"/>
-              </w:rPr>
               <w:t>₹50,00,000</w:t>
             </w:r>
           </w:p>
         </w:tc>
       </w:tr>
       <w:tr>
-        <w:tc>
-          <w:tcPr>
-            <w:tcW w:w="4500" w:type="dxa"/>
-            <w:tcBorders>
-              <w:top w:val="single" w:sz="4" w:space="0" w:color="CBD5E1"/>
-              <w:left w:val="single" w:sz="4" w:space="0" w:color="CBD5E1"/>
-              <w:bottom w:val="single" w:sz="4" w:space="0" w:color="CBD5E1"/>
-              <w:right w:val="single" w:sz="4" w:space="0" w:color="CBD5E1"/>
-            </w:tcBorders>
-            <w:shd w:val="clear" w:color="auto" w:fill="FFFFFF"/>
-          </w:tcPr>
-          <w:p>
-            <w:r>
-              <w:rPr>
-                <w:color w:val="1E293B"/>
-              </w:rPr>
+        <w:tblPrEx>
+          <w:tblCellMar>
+            <w:top w:w="0" w:type="dxa"/>
+            <w:bottom w:w="0" w:type="dxa"/>
+          </w:tblCellMar>
+        </w:tblPrEx>
+        <w:tc>
+          <w:tcPr>
+            <w:tcW w:w="4500" w:type="dxa"/>
+            <w:tcBorders>
+              <w:top w:val="single" w:sz="4" w:space="0" w:color="CBD5E1"/>
+              <w:left w:val="single" w:sz="4" w:space="0" w:color="CBD5E1"/>
+              <w:bottom w:val="single" w:sz="4" w:space="0" w:color="CBD5E1"/>
+              <w:right w:val="single" w:sz="4" w:space="0" w:color="CBD5E1"/>
+            </w:tcBorders>
+            <w:shd w:val="clear" w:color="auto" w:fill="FFFFFF"/>
+          </w:tcPr>
+          <w:p>
+            <w:r>
               <w:t>Floating Interest Rate ($r$)</w:t>
             </w:r>
           </w:p>
@@ -728,31 +872,31 @@
           </w:tcPr>
           <w:p>
             <w:r>
-              <w:rPr>
-                <w:color w:val="1E293B"/>
-              </w:rPr>
               <w:t>13.5% per annum</w:t>
             </w:r>
           </w:p>
         </w:tc>
       </w:tr>
       <w:tr>
-        <w:tc>
-          <w:tcPr>
-            <w:tcW w:w="4500" w:type="dxa"/>
-            <w:tcBorders>
-              <w:top w:val="single" w:sz="4" w:space="0" w:color="CBD5E1"/>
-              <w:left w:val="single" w:sz="4" w:space="0" w:color="CBD5E1"/>
-              <w:bottom w:val="single" w:sz="4" w:space="0" w:color="CBD5E1"/>
-              <w:right w:val="single" w:sz="4" w:space="0" w:color="CBD5E1"/>
-            </w:tcBorders>
-            <w:shd w:val="clear" w:color="auto" w:fill="FFFFFF"/>
-          </w:tcPr>
-          <w:p>
-            <w:r>
-              <w:rPr>
-                <w:color w:val="1E293B"/>
-              </w:rPr>
+        <w:tblPrEx>
+          <w:tblCellMar>
+            <w:top w:w="0" w:type="dxa"/>
+            <w:bottom w:w="0" w:type="dxa"/>
+          </w:tblCellMar>
+        </w:tblPrEx>
+        <w:tc>
+          <w:tcPr>
+            <w:tcW w:w="4500" w:type="dxa"/>
+            <w:tcBorders>
+              <w:top w:val="single" w:sz="4" w:space="0" w:color="CBD5E1"/>
+              <w:left w:val="single" w:sz="4" w:space="0" w:color="CBD5E1"/>
+              <w:bottom w:val="single" w:sz="4" w:space="0" w:color="CBD5E1"/>
+              <w:right w:val="single" w:sz="4" w:space="0" w:color="CBD5E1"/>
+            </w:tcBorders>
+            <w:shd w:val="clear" w:color="auto" w:fill="FFFFFF"/>
+          </w:tcPr>
+          <w:p>
+            <w:r>
               <w:t>Repayment Tenure ($n$)</w:t>
             </w:r>
           </w:p>
@@ -770,31 +914,31 @@
           </w:tcPr>
           <w:p>
             <w:r>
-              <w:rPr>
-                <w:color w:val="1E293B"/>
-              </w:rPr>
               <w:t>10 Years (120 Months)</w:t>
             </w:r>
           </w:p>
         </w:tc>
       </w:tr>
       <w:tr>
-        <w:tc>
-          <w:tcPr>
-            <w:tcW w:w="4500" w:type="dxa"/>
-            <w:tcBorders>
-              <w:top w:val="single" w:sz="4" w:space="0" w:color="CBD5E1"/>
-              <w:left w:val="single" w:sz="4" w:space="0" w:color="CBD5E1"/>
-              <w:bottom w:val="single" w:sz="4" w:space="0" w:color="CBD5E1"/>
-              <w:right w:val="single" w:sz="4" w:space="0" w:color="CBD5E1"/>
-            </w:tcBorders>
-            <w:shd w:val="clear" w:color="auto" w:fill="FFFFFF"/>
-          </w:tcPr>
-          <w:p>
-            <w:r>
-              <w:rPr>
-                <w:color w:val="1E293B"/>
-              </w:rPr>
+        <w:tblPrEx>
+          <w:tblCellMar>
+            <w:top w:w="0" w:type="dxa"/>
+            <w:bottom w:w="0" w:type="dxa"/>
+          </w:tblCellMar>
+        </w:tblPrEx>
+        <w:tc>
+          <w:tcPr>
+            <w:tcW w:w="4500" w:type="dxa"/>
+            <w:tcBorders>
+              <w:top w:val="single" w:sz="4" w:space="0" w:color="CBD5E1"/>
+              <w:left w:val="single" w:sz="4" w:space="0" w:color="CBD5E1"/>
+              <w:bottom w:val="single" w:sz="4" w:space="0" w:color="CBD5E1"/>
+              <w:right w:val="single" w:sz="4" w:space="0" w:color="CBD5E1"/>
+            </w:tcBorders>
+            <w:shd w:val="clear" w:color="auto" w:fill="FFFFFF"/>
+          </w:tcPr>
+          <w:p>
+            <w:r>
               <w:t>Monthly Amortization (EMI)</w:t>
             </w:r>
           </w:p>
@@ -812,31 +956,31 @@
           </w:tcPr>
           <w:p>
             <w:r>
-              <w:rPr>
-                <w:color w:val="1E293B"/>
-              </w:rPr>
               <w:t>₹76,100 / month</w:t>
             </w:r>
           </w:p>
         </w:tc>
       </w:tr>
       <w:tr>
-        <w:tc>
-          <w:tcPr>
-            <w:tcW w:w="4500" w:type="dxa"/>
-            <w:tcBorders>
-              <w:top w:val="single" w:sz="4" w:space="0" w:color="CBD5E1"/>
-              <w:left w:val="single" w:sz="4" w:space="0" w:color="CBD5E1"/>
-              <w:bottom w:val="single" w:sz="4" w:space="0" w:color="CBD5E1"/>
-              <w:right w:val="single" w:sz="4" w:space="0" w:color="CBD5E1"/>
-            </w:tcBorders>
-            <w:shd w:val="clear" w:color="auto" w:fill="FFFFFF"/>
-          </w:tcPr>
-          <w:p>
-            <w:r>
-              <w:rPr>
-                <w:color w:val="1E293B"/>
-              </w:rPr>
+        <w:tblPrEx>
+          <w:tblCellMar>
+            <w:top w:w="0" w:type="dxa"/>
+            <w:bottom w:w="0" w:type="dxa"/>
+          </w:tblCellMar>
+        </w:tblPrEx>
+        <w:tc>
+          <w:tcPr>
+            <w:tcW w:w="4500" w:type="dxa"/>
+            <w:tcBorders>
+              <w:top w:val="single" w:sz="4" w:space="0" w:color="CBD5E1"/>
+              <w:left w:val="single" w:sz="4" w:space="0" w:color="CBD5E1"/>
+              <w:bottom w:val="single" w:sz="4" w:space="0" w:color="CBD5E1"/>
+              <w:right w:val="single" w:sz="4" w:space="0" w:color="CBD5E1"/>
+            </w:tcBorders>
+            <w:shd w:val="clear" w:color="auto" w:fill="FFFFFF"/>
+          </w:tcPr>
+          <w:p>
+            <w:r>
               <w:t>Cumulative Outlay Over Tenure</w:t>
             </w:r>
           </w:p>
@@ -854,31 +998,31 @@
           </w:tcPr>
           <w:p>
             <w:r>
-              <w:rPr>
-                <w:color w:val="1E293B"/>
-              </w:rPr>
               <w:t>₹91,32,000</w:t>
             </w:r>
           </w:p>
         </w:tc>
       </w:tr>
       <w:tr>
-        <w:tc>
-          <w:tcPr>
-            <w:tcW w:w="4500" w:type="dxa"/>
-            <w:tcBorders>
-              <w:top w:val="single" w:sz="4" w:space="0" w:color="CBD5E1"/>
-              <w:left w:val="single" w:sz="4" w:space="0" w:color="CBD5E1"/>
-              <w:bottom w:val="single" w:sz="4" w:space="0" w:color="CBD5E1"/>
-              <w:right w:val="single" w:sz="4" w:space="0" w:color="CBD5E1"/>
-            </w:tcBorders>
-            <w:shd w:val="clear" w:color="auto" w:fill="FFFFFF"/>
-          </w:tcPr>
-          <w:p>
-            <w:r>
-              <w:rPr>
-                <w:color w:val="1E293B"/>
-              </w:rPr>
+        <w:tblPrEx>
+          <w:tblCellMar>
+            <w:top w:w="0" w:type="dxa"/>
+            <w:bottom w:w="0" w:type="dxa"/>
+          </w:tblCellMar>
+        </w:tblPrEx>
+        <w:tc>
+          <w:tcPr>
+            <w:tcW w:w="4500" w:type="dxa"/>
+            <w:tcBorders>
+              <w:top w:val="single" w:sz="4" w:space="0" w:color="CBD5E1"/>
+              <w:left w:val="single" w:sz="4" w:space="0" w:color="CBD5E1"/>
+              <w:bottom w:val="single" w:sz="4" w:space="0" w:color="CBD5E1"/>
+              <w:right w:val="single" w:sz="4" w:space="0" w:color="CBD5E1"/>
+            </w:tcBorders>
+            <w:shd w:val="clear" w:color="auto" w:fill="FFFFFF"/>
+          </w:tcPr>
+          <w:p>
+            <w:r>
               <w:t>Total Interest Serviced ($I$)</w:t>
             </w:r>
           </w:p>
@@ -896,9 +1040,6 @@
           </w:tcPr>
           <w:p>
             <w:r>
-              <w:rPr>
-                <w:color w:val="1E293B"/>
-              </w:rPr>
               <w:t>₹41,32,000 (82.6% of Principal!)</w:t>
             </w:r>
           </w:p>
@@ -907,7 +1048,15 @@
     </w:tbl>
     <w:p>
       <w:r>
-        <w:t>If an international graduate encounters an extended hiring freeze abroad or is forced to return due to visa expiration, they re-enter the domestic Indian labor market with a starting salary distribution of ₹6,00,000 to ₹12,00,000 per annum (₹50,000 to ₹1,00,000 gross monthly).</w:t>
+        <w:t xml:space="preserve">If an international graduate encounters an extended hiring freeze abroad or is forced to return due to visa expiration, they re-enter the domestic Indian </w:t>
+      </w:r>
+      <w:proofErr w:type="spellStart"/>
+      <w:r>
+        <w:t>labor</w:t>
+      </w:r>
+      <w:proofErr w:type="spellEnd"/>
+      <w:r>
+        <w:t xml:space="preserve"> market with a starting salary distribution of ₹6,00,000 to ₹12,00,000 per annum (₹50,000 to ₹1,00,000 gross monthly).</w:t>
       </w:r>
     </w:p>
     <w:p>
@@ -950,7 +1099,7 @@
           <w:b/>
           <w:color w:val="0D9488"/>
         </w:rPr>
-        <w:t>✓ </w:t>
+        <w:t>✓</w:t>
       </w:r>
       <w:r>
         <w:t>100% Tuition Fee Waivers: State-funded research universities (TUM, RWTH Aachen, TU Berlin) charge zero tuition.</w:t>
@@ -965,10 +1114,26 @@
           <w:b/>
           <w:color w:val="0D9488"/>
         </w:rPr>
-        <w:t>✓ </w:t>
-      </w:r>
-      <w:r>
-        <w:t>Statutory Labor Integration: Fachkräfteeinwanderungsgesetz 2.0 &amp; the Opportunity Card (Chancenkarte).</w:t>
+        <w:t>✓</w:t>
+      </w:r>
+      <w:r>
+        <w:t xml:space="preserve">Statutory Labor Integration: </w:t>
+      </w:r>
+      <w:proofErr w:type="spellStart"/>
+      <w:r>
+        <w:t>Fachkräfteeinwanderungsgesetz</w:t>
+      </w:r>
+      <w:proofErr w:type="spellEnd"/>
+      <w:r>
+        <w:t xml:space="preserve"> 2.0 &amp; the Opportunity Card (</w:t>
+      </w:r>
+      <w:proofErr w:type="spellStart"/>
+      <w:r>
+        <w:t>Chancenkarte</w:t>
+      </w:r>
+      <w:proofErr w:type="spellEnd"/>
+      <w:r>
+        <w:t>).</w:t>
       </w:r>
     </w:p>
     <w:p>
@@ -980,7 +1145,7 @@
           <w:b/>
           <w:color w:val="0D9488"/>
         </w:rPr>
-        <w:t>✓ </w:t>
+        <w:t>✓</w:t>
       </w:r>
       <w:r>
         <w:t>Extended Post-Study Rights: 18-month legal job search authorization across all German industrial hubs.</w:t>
@@ -995,10 +1160,18 @@
           <w:b/>
           <w:color w:val="0D9488"/>
         </w:rPr>
-        <w:t>✓ </w:t>
-      </w:r>
-      <w:r>
-        <w:t>Result: Zero Student Debt + World-Class STEM Credentials $\rightarrow$ Direct integration into global corporations (BMW, Siemens, Bosch, SAP).</w:t>
+        <w:t>✓</w:t>
+      </w:r>
+      <w:r>
+        <w:t>Result: Zero Student Debt + World-Class STEM Credentials $\</w:t>
+      </w:r>
+      <w:proofErr w:type="spellStart"/>
+      <w:r>
+        <w:t>rightarrow</w:t>
+      </w:r>
+      <w:proofErr w:type="spellEnd"/>
+      <w:r>
+        <w:t>$ Direct integration into global corporations (BMW, Siemens, Bosch, SAP).</w:t>
       </w:r>
     </w:p>
     <w:p>
@@ -1006,25 +1179,103 @@
         <w:pStyle w:val="Heading2"/>
       </w:pPr>
       <w:r>
-        <w:t>A. Demographics &amp; Institutional Standing (DAAD &amp; Destatis)</w:t>
-      </w:r>
-    </w:p>
-    <w:p>
-      <w:r>
-        <w:t>Official data published by the Statistisches Bundesamt (Destatis) and the Deutscher Akademischer Austauschdienst (DAAD) confirms that Indian nationals have surpassed all other global demographics to become the #1 international student cohort in Germany (&gt;45,000 enrolled candidates).</w:t>
+        <w:t xml:space="preserve">A. Demographics &amp; Institutional Standing (DAAD &amp; </w:t>
+      </w:r>
+      <w:proofErr w:type="spellStart"/>
+      <w:r>
+        <w:t>Destatis</w:t>
+      </w:r>
+      <w:proofErr w:type="spellEnd"/>
+      <w:r>
+        <w:t>)</w:t>
+      </w:r>
+    </w:p>
+    <w:p>
+      <w:r>
+        <w:t xml:space="preserve">Official data published by the </w:t>
+      </w:r>
+      <w:proofErr w:type="spellStart"/>
+      <w:r>
+        <w:t>Statistisches</w:t>
+      </w:r>
+      <w:proofErr w:type="spellEnd"/>
+      <w:r>
+        <w:t xml:space="preserve"> </w:t>
+      </w:r>
+      <w:proofErr w:type="spellStart"/>
+      <w:r>
+        <w:t>Bundesamt</w:t>
+      </w:r>
+      <w:proofErr w:type="spellEnd"/>
+      <w:r>
+        <w:t xml:space="preserve"> (</w:t>
+      </w:r>
+      <w:proofErr w:type="spellStart"/>
+      <w:r>
+        <w:t>Destatis</w:t>
+      </w:r>
+      <w:proofErr w:type="spellEnd"/>
+      <w:r>
+        <w:t xml:space="preserve">) and the Deutscher </w:t>
+      </w:r>
+      <w:proofErr w:type="spellStart"/>
+      <w:r>
+        <w:t>Akademischer</w:t>
+      </w:r>
+      <w:proofErr w:type="spellEnd"/>
+      <w:r>
+        <w:t xml:space="preserve"> </w:t>
+      </w:r>
+      <w:proofErr w:type="spellStart"/>
+      <w:r>
+        <w:t>Austauschdienst</w:t>
+      </w:r>
+      <w:proofErr w:type="spellEnd"/>
+      <w:r>
+        <w:t xml:space="preserve"> (DAAD) confirms that Indian nationals have surpassed all other global demographics to become the #1 international student cohort in Germany (&gt;45,000 enrolled candidates).</w:t>
       </w:r>
     </w:p>
     <w:p>
       <w:pPr>
         <w:pStyle w:val="Heading2"/>
       </w:pPr>
-      <w:r>
+    </w:p>
+    <w:p>
+      <w:pPr>
+        <w:pStyle w:val="Heading2"/>
+      </w:pPr>
+      <w:r>
+        <w:lastRenderedPageBreak/>
         <w:t>B. 100% Tuition Fee Waivers</w:t>
       </w:r>
     </w:p>
     <w:p>
       <w:r>
-        <w:t>In 15 out of 16 German federal states, public universities (Staatliche Hochschulen) charge zero tuition fees for international candidates enrolled in undergraduate and postgraduate disciplines. Candidates pay merely a nominal administrative semester contribution (Semesterbeitrag) of €150 to €350, which includes a comprehensive regional transit pass (Semesterticket) providing free state-wide public transportation.</w:t>
+        <w:t xml:space="preserve">In 15 out of 16 German federal states, public universities (Staatliche </w:t>
+      </w:r>
+      <w:proofErr w:type="spellStart"/>
+      <w:r>
+        <w:t>Hochschulen</w:t>
+      </w:r>
+      <w:proofErr w:type="spellEnd"/>
+      <w:r>
+        <w:t>) charge zero tuition fees for international candidates enrolled in undergraduate and postgraduate disciplines. Candidates pay merely a nominal administrative semester contribution (</w:t>
+      </w:r>
+      <w:proofErr w:type="spellStart"/>
+      <w:r>
+        <w:t>Semesterbeitrag</w:t>
+      </w:r>
+      <w:proofErr w:type="spellEnd"/>
+      <w:r>
+        <w:t>) of €150 to €350, which includes a comprehensive regional transit pass (</w:t>
+      </w:r>
+      <w:proofErr w:type="spellStart"/>
+      <w:r>
+        <w:t>Semesterticket</w:t>
+      </w:r>
+      <w:proofErr w:type="spellEnd"/>
+      <w:r>
+        <w:t>) providing free state-wide public transportation.</w:t>
       </w:r>
     </w:p>
     <w:p>
@@ -1032,12 +1283,28 @@
         <w:pStyle w:val="Heading2"/>
       </w:pPr>
       <w:r>
-        <w:t>C. Statutory Labor Integration (*Fachkräfteeinwanderungsgesetz*)</w:t>
-      </w:r>
-    </w:p>
-    <w:p>
-      <w:r>
-        <w:t>Germany’s updated Skilled Immigration Act (Fachkräfteeinwanderungsgesetz) provides international graduates with:</w:t>
+        <w:t>C. Statutory Labor Integration (*</w:t>
+      </w:r>
+      <w:proofErr w:type="spellStart"/>
+      <w:r>
+        <w:t>Fachkräfteeinwanderungsgesetz</w:t>
+      </w:r>
+      <w:proofErr w:type="spellEnd"/>
+      <w:r>
+        <w:t>*)</w:t>
+      </w:r>
+    </w:p>
+    <w:p>
+      <w:r>
+        <w:t>Germany’s updated Skilled Immigration Act (</w:t>
+      </w:r>
+      <w:proofErr w:type="spellStart"/>
+      <w:r>
+        <w:t>Fachkräfteeinwanderungsgesetz</w:t>
+      </w:r>
+      <w:proofErr w:type="spellEnd"/>
+      <w:r>
+        <w:t>) provides international graduates with:</w:t>
       </w:r>
     </w:p>
     <w:p>
@@ -1049,7 +1316,7 @@
           <w:b/>
           <w:color w:val="0D9488"/>
         </w:rPr>
-        <w:t>✓ </w:t>
+        <w:t>✓</w:t>
       </w:r>
       <w:r>
         <w:t>An 18-Month Job Seeker Visa immediately post-graduation.</w:t>
@@ -1064,7 +1331,7 @@
           <w:b/>
           <w:color w:val="0D9488"/>
         </w:rPr>
-        <w:t>✓ </w:t>
+        <w:t>✓</w:t>
       </w:r>
       <w:r>
         <w:t>An expanded part-time employment allowance of 140 full days (or 280 half days) per calendar year.</w:t>
@@ -1079,10 +1346,18 @@
           <w:b/>
           <w:color w:val="0D9488"/>
         </w:rPr>
-        <w:t>✓ </w:t>
-      </w:r>
-      <w:r>
-        <w:t>A streamlined pathway to Permanent Residency (Niederlassungserlaubnis) within 21 to 24 months of skilled employment.</w:t>
+        <w:t>✓</w:t>
+      </w:r>
+      <w:r>
+        <w:t>A streamlined pathway to Permanent Residency (</w:t>
+      </w:r>
+      <w:proofErr w:type="spellStart"/>
+      <w:r>
+        <w:t>Niederlassungserlaubnis</w:t>
+      </w:r>
+      <w:proofErr w:type="spellEnd"/>
+      <w:r>
+        <w:t>) within 21 to 24 months of skilled employment.</w:t>
       </w:r>
     </w:p>
     <w:p>
@@ -1095,7 +1370,15 @@
         <w:pStyle w:val="Heading1"/>
       </w:pPr>
       <w:r>
-        <w:t>6. The Constitutional Welfare Arbitrage: Italy’s DSU &amp; ISEE Parificato Model</w:t>
+        <w:t xml:space="preserve">6. The Constitutional Welfare Arbitrage: Italy’s DSU &amp; ISEE </w:t>
+      </w:r>
+      <w:proofErr w:type="spellStart"/>
+      <w:r>
+        <w:t>Parificato</w:t>
+      </w:r>
+      <w:proofErr w:type="spellEnd"/>
+      <w:r>
+        <w:t xml:space="preserve"> Model</w:t>
       </w:r>
     </w:p>
     <w:p>
@@ -1113,7 +1396,23 @@
     </w:p>
     <w:p>
       <w:r>
-        <w:t>Under Article 34 of the Italian Constitution (Costituzione della Repubblica Italiana), higher education is a protected civil right:</w:t>
+        <w:t>Under Article 34 of the Italian Constitution (</w:t>
+      </w:r>
+      <w:proofErr w:type="spellStart"/>
+      <w:r>
+        <w:t>Costituzione</w:t>
+      </w:r>
+      <w:proofErr w:type="spellEnd"/>
+      <w:r>
+        <w:t xml:space="preserve"> della Repubblica </w:t>
+      </w:r>
+      <w:proofErr w:type="spellStart"/>
+      <w:r>
+        <w:t>Italiana</w:t>
+      </w:r>
+      <w:proofErr w:type="spellEnd"/>
+      <w:r>
+        <w:t>), higher education is a protected civil right:</w:t>
       </w:r>
     </w:p>
     <w:p>
@@ -1137,12 +1436,60 @@
         <w:pStyle w:val="Heading2"/>
       </w:pPr>
       <w:r>
-        <w:t>B. The DSU System &amp; ISEE Parificato Calculation</w:t>
-      </w:r>
-    </w:p>
-    <w:p>
-      <w:r>
-        <w:t>Pursuant to Decreto Legislativo 68/2012, higher-education regional boards—such as DiscoLazio (Lazio), ER.GO (Emilia-Romagna), and EDISU (Piedmont)—administer statutory grants based on financial evaluation known as the ISEE Parificato (Equivalent Economic Situation Indicator).</w:t>
+        <w:t xml:space="preserve">B. The DSU System &amp; ISEE </w:t>
+      </w:r>
+      <w:proofErr w:type="spellStart"/>
+      <w:r>
+        <w:t>Parificato</w:t>
+      </w:r>
+      <w:proofErr w:type="spellEnd"/>
+      <w:r>
+        <w:t xml:space="preserve"> Calculation</w:t>
+      </w:r>
+    </w:p>
+    <w:p>
+      <w:r>
+        <w:t xml:space="preserve">Pursuant to </w:t>
+      </w:r>
+      <w:proofErr w:type="spellStart"/>
+      <w:r>
+        <w:t>Decreto</w:t>
+      </w:r>
+      <w:proofErr w:type="spellEnd"/>
+      <w:r>
+        <w:t xml:space="preserve"> </w:t>
+      </w:r>
+      <w:proofErr w:type="spellStart"/>
+      <w:r>
+        <w:t>Legislativo</w:t>
+      </w:r>
+      <w:proofErr w:type="spellEnd"/>
+      <w:r>
+        <w:t xml:space="preserve"> 68/2012, higher-education regional boards—such as </w:t>
+      </w:r>
+      <w:proofErr w:type="spellStart"/>
+      <w:r>
+        <w:t>DiscoLazio</w:t>
+      </w:r>
+      <w:proofErr w:type="spellEnd"/>
+      <w:r>
+        <w:t xml:space="preserve"> (Lazio), </w:t>
+      </w:r>
+      <w:proofErr w:type="gramStart"/>
+      <w:r>
+        <w:t>ER.GO</w:t>
+      </w:r>
+      <w:proofErr w:type="gramEnd"/>
+      <w:r>
+        <w:t xml:space="preserve"> (Emilia-Romagna), and EDISU (Piedmont)—administer statutory grants based on financial evaluation known as the ISEE </w:t>
+      </w:r>
+      <w:proofErr w:type="spellStart"/>
+      <w:r>
+        <w:t>Parificato</w:t>
+      </w:r>
+      <w:proofErr w:type="spellEnd"/>
+      <w:r>
+        <w:t xml:space="preserve"> (Equivalent Economic Situation Indicator).</w:t>
       </w:r>
     </w:p>
     <w:p>
@@ -1150,7 +1497,15 @@
         <w:pStyle w:val="Heading2"/>
       </w:pPr>
       <w:r>
-        <w:t>📋 ISEE Parificato Statutory Formula &amp; Thresholds</w:t>
+        <w:t xml:space="preserve"> ISEE </w:t>
+      </w:r>
+      <w:proofErr w:type="spellStart"/>
+      <w:r>
+        <w:t>Parificato</w:t>
+      </w:r>
+      <w:proofErr w:type="spellEnd"/>
+      <w:r>
+        <w:t xml:space="preserve"> Statutory Formula &amp; Thresholds</w:t>
       </w:r>
     </w:p>
     <w:p>
@@ -1164,8 +1519,25 @@
     <w:tbl>
       <w:tblPr>
         <w:tblW w:w="9000" w:type="dxa"/>
+        <w:tblInd w:w="10" w:type="dxa"/>
+        <w:tblCellMar>
+          <w:left w:w="10" w:type="dxa"/>
+          <w:right w:w="10" w:type="dxa"/>
+        </w:tblCellMar>
+        <w:tblLook w:val="04A0" w:firstRow="1" w:lastRow="0" w:firstColumn="1" w:lastColumn="0" w:noHBand="0" w:noVBand="1"/>
       </w:tblPr>
+      <w:tblGrid>
+        <w:gridCol w:w="3038"/>
+        <w:gridCol w:w="3014"/>
+        <w:gridCol w:w="2948"/>
+      </w:tblGrid>
       <w:tr>
+        <w:tblPrEx>
+          <w:tblCellMar>
+            <w:top w:w="0" w:type="dxa"/>
+            <w:bottom w:w="0" w:type="dxa"/>
+          </w:tblCellMar>
+        </w:tblPrEx>
         <w:tc>
           <w:tcPr>
             <w:tcW w:w="4500" w:type="dxa"/>
@@ -1231,22 +1603,25 @@
         </w:tc>
       </w:tr>
       <w:tr>
-        <w:tc>
-          <w:tcPr>
-            <w:tcW w:w="4500" w:type="dxa"/>
-            <w:tcBorders>
-              <w:top w:val="single" w:sz="4" w:space="0" w:color="CBD5E1"/>
-              <w:left w:val="single" w:sz="4" w:space="0" w:color="CBD5E1"/>
-              <w:bottom w:val="single" w:sz="4" w:space="0" w:color="CBD5E1"/>
-              <w:right w:val="single" w:sz="4" w:space="0" w:color="CBD5E1"/>
-            </w:tcBorders>
-            <w:shd w:val="clear" w:color="auto" w:fill="FFFFFF"/>
-          </w:tcPr>
-          <w:p>
-            <w:r>
-              <w:rPr>
-                <w:color w:val="1E293B"/>
-              </w:rPr>
+        <w:tblPrEx>
+          <w:tblCellMar>
+            <w:top w:w="0" w:type="dxa"/>
+            <w:bottom w:w="0" w:type="dxa"/>
+          </w:tblCellMar>
+        </w:tblPrEx>
+        <w:tc>
+          <w:tcPr>
+            <w:tcW w:w="4500" w:type="dxa"/>
+            <w:tcBorders>
+              <w:top w:val="single" w:sz="4" w:space="0" w:color="CBD5E1"/>
+              <w:left w:val="single" w:sz="4" w:space="0" w:color="CBD5E1"/>
+              <w:bottom w:val="single" w:sz="4" w:space="0" w:color="CBD5E1"/>
+              <w:right w:val="single" w:sz="4" w:space="0" w:color="CBD5E1"/>
+            </w:tcBorders>
+            <w:shd w:val="clear" w:color="auto" w:fill="FFFFFF"/>
+          </w:tcPr>
+          <w:p>
+            <w:r>
               <w:t>Household Income ($ISR$)</w:t>
             </w:r>
           </w:p>
@@ -1264,9 +1639,6 @@
           </w:tcPr>
           <w:p>
             <w:r>
-              <w:rPr>
-                <w:color w:val="1E293B"/>
-              </w:rPr>
               <w:t>Cumulative annual gross family earnings</w:t>
             </w:r>
           </w:p>
@@ -1284,31 +1656,31 @@
           </w:tcPr>
           <w:p>
             <w:r>
-              <w:rPr>
-                <w:color w:val="1E293B"/>
-              </w:rPr>
               <w:t>Verified via Indian income tax records</w:t>
             </w:r>
           </w:p>
         </w:tc>
       </w:tr>
       <w:tr>
-        <w:tc>
-          <w:tcPr>
-            <w:tcW w:w="4500" w:type="dxa"/>
-            <w:tcBorders>
-              <w:top w:val="single" w:sz="4" w:space="0" w:color="CBD5E1"/>
-              <w:left w:val="single" w:sz="4" w:space="0" w:color="CBD5E1"/>
-              <w:bottom w:val="single" w:sz="4" w:space="0" w:color="CBD5E1"/>
-              <w:right w:val="single" w:sz="4" w:space="0" w:color="CBD5E1"/>
-            </w:tcBorders>
-            <w:shd w:val="clear" w:color="auto" w:fill="FFFFFF"/>
-          </w:tcPr>
-          <w:p>
-            <w:r>
-              <w:rPr>
-                <w:color w:val="1E293B"/>
-              </w:rPr>
+        <w:tblPrEx>
+          <w:tblCellMar>
+            <w:top w:w="0" w:type="dxa"/>
+            <w:bottom w:w="0" w:type="dxa"/>
+          </w:tblCellMar>
+        </w:tblPrEx>
+        <w:tc>
+          <w:tcPr>
+            <w:tcW w:w="4500" w:type="dxa"/>
+            <w:tcBorders>
+              <w:top w:val="single" w:sz="4" w:space="0" w:color="CBD5E1"/>
+              <w:left w:val="single" w:sz="4" w:space="0" w:color="CBD5E1"/>
+              <w:bottom w:val="single" w:sz="4" w:space="0" w:color="CBD5E1"/>
+              <w:right w:val="single" w:sz="4" w:space="0" w:color="CBD5E1"/>
+            </w:tcBorders>
+            <w:shd w:val="clear" w:color="auto" w:fill="FFFFFF"/>
+          </w:tcPr>
+          <w:p>
+            <w:r>
               <w:t>Asset Valuation ($ISP$)</w:t>
             </w:r>
           </w:p>
@@ -1326,9 +1698,6 @@
           </w:tcPr>
           <w:p>
             <w:r>
-              <w:rPr>
-                <w:color w:val="1E293B"/>
-              </w:rPr>
               <w:t>20% real estate &amp; movable asset equity</w:t>
             </w:r>
           </w:p>
@@ -1346,31 +1715,31 @@
           </w:tcPr>
           <w:p>
             <w:r>
-              <w:rPr>
-                <w:color w:val="1E293B"/>
-              </w:rPr>
               <w:t>Verified via official bank and property records</w:t>
             </w:r>
           </w:p>
         </w:tc>
       </w:tr>
       <w:tr>
-        <w:tc>
-          <w:tcPr>
-            <w:tcW w:w="4500" w:type="dxa"/>
-            <w:tcBorders>
-              <w:top w:val="single" w:sz="4" w:space="0" w:color="CBD5E1"/>
-              <w:left w:val="single" w:sz="4" w:space="0" w:color="CBD5E1"/>
-              <w:bottom w:val="single" w:sz="4" w:space="0" w:color="CBD5E1"/>
-              <w:right w:val="single" w:sz="4" w:space="0" w:color="CBD5E1"/>
-            </w:tcBorders>
-            <w:shd w:val="clear" w:color="auto" w:fill="FFFFFF"/>
-          </w:tcPr>
-          <w:p>
-            <w:r>
-              <w:rPr>
-                <w:color w:val="1E293B"/>
-              </w:rPr>
+        <w:tblPrEx>
+          <w:tblCellMar>
+            <w:top w:w="0" w:type="dxa"/>
+            <w:bottom w:w="0" w:type="dxa"/>
+          </w:tblCellMar>
+        </w:tblPrEx>
+        <w:tc>
+          <w:tcPr>
+            <w:tcW w:w="4500" w:type="dxa"/>
+            <w:tcBorders>
+              <w:top w:val="single" w:sz="4" w:space="0" w:color="CBD5E1"/>
+              <w:left w:val="single" w:sz="4" w:space="0" w:color="CBD5E1"/>
+              <w:bottom w:val="single" w:sz="4" w:space="0" w:color="CBD5E1"/>
+              <w:right w:val="single" w:sz="4" w:space="0" w:color="CBD5E1"/>
+            </w:tcBorders>
+            <w:shd w:val="clear" w:color="auto" w:fill="FFFFFF"/>
+          </w:tcPr>
+          <w:p>
+            <w:r>
               <w:t>Equivalence Scale ($VSE$)</w:t>
             </w:r>
           </w:p>
@@ -1388,9 +1757,6 @@
           </w:tcPr>
           <w:p>
             <w:r>
-              <w:rPr>
-                <w:color w:val="1E293B"/>
-              </w:rPr>
               <w:t>Adjusted family size coefficient</w:t>
             </w:r>
           </w:p>
@@ -1408,31 +1774,31 @@
           </w:tcPr>
           <w:p>
             <w:r>
-              <w:rPr>
-                <w:color w:val="1E293B"/>
-              </w:rPr>
               <w:t>Standard factor (2.04 to 2.85)</w:t>
             </w:r>
           </w:p>
         </w:tc>
       </w:tr>
       <w:tr>
-        <w:tc>
-          <w:tcPr>
-            <w:tcW w:w="4500" w:type="dxa"/>
-            <w:tcBorders>
-              <w:top w:val="single" w:sz="4" w:space="0" w:color="CBD5E1"/>
-              <w:left w:val="single" w:sz="4" w:space="0" w:color="CBD5E1"/>
-              <w:bottom w:val="single" w:sz="4" w:space="0" w:color="CBD5E1"/>
-              <w:right w:val="single" w:sz="4" w:space="0" w:color="CBD5E1"/>
-            </w:tcBorders>
-            <w:shd w:val="clear" w:color="auto" w:fill="FFFFFF"/>
-          </w:tcPr>
-          <w:p>
-            <w:r>
-              <w:rPr>
-                <w:color w:val="1E293B"/>
-              </w:rPr>
+        <w:tblPrEx>
+          <w:tblCellMar>
+            <w:top w:w="0" w:type="dxa"/>
+            <w:bottom w:w="0" w:type="dxa"/>
+          </w:tblCellMar>
+        </w:tblPrEx>
+        <w:tc>
+          <w:tcPr>
+            <w:tcW w:w="4500" w:type="dxa"/>
+            <w:tcBorders>
+              <w:top w:val="single" w:sz="4" w:space="0" w:color="CBD5E1"/>
+              <w:left w:val="single" w:sz="4" w:space="0" w:color="CBD5E1"/>
+              <w:bottom w:val="single" w:sz="4" w:space="0" w:color="CBD5E1"/>
+              <w:right w:val="single" w:sz="4" w:space="0" w:color="CBD5E1"/>
+            </w:tcBorders>
+            <w:shd w:val="clear" w:color="auto" w:fill="FFFFFF"/>
+          </w:tcPr>
+          <w:p>
+            <w:r>
               <w:t>Statutory Eligibility Threshold</w:t>
             </w:r>
           </w:p>
@@ -1450,30 +1816,41 @@
           </w:tcPr>
           <w:p>
             <w:r>
-              <w:rPr>
-                <w:color w:val="1E293B"/>
-              </w:rPr>
-              <w:t>Total ISEE Value &amp;lt; €23,000 / year (~₹21L–₹23L)</w:t>
-            </w:r>
-          </w:p>
-        </w:tc>
-        <w:tc>
-          <w:tcPr>
-            <w:tcW w:w="4500" w:type="dxa"/>
-            <w:tcBorders>
-              <w:top w:val="single" w:sz="4" w:space="0" w:color="CBD5E1"/>
-              <w:left w:val="single" w:sz="4" w:space="0" w:color="CBD5E1"/>
-              <w:bottom w:val="single" w:sz="4" w:space="0" w:color="CBD5E1"/>
-              <w:right w:val="single" w:sz="4" w:space="0" w:color="CBD5E1"/>
-            </w:tcBorders>
-            <w:shd w:val="clear" w:color="auto" w:fill="FFFFFF"/>
-          </w:tcPr>
-          <w:p>
-            <w:r>
-              <w:rPr>
-                <w:color w:val="1E293B"/>
-              </w:rPr>
-              <w:t>100% Full Tuition Waiver + €8,500 Cash Grant</w:t>
+              <w:t>Total ISEE Value &amp;</w:t>
+            </w:r>
+            <w:proofErr w:type="spellStart"/>
+            <w:r>
+              <w:t>lt</w:t>
+            </w:r>
+            <w:proofErr w:type="spellEnd"/>
+            <w:r>
+              <w:t xml:space="preserve">; €23,000 / </w:t>
+            </w:r>
+            <w:r>
+              <w:lastRenderedPageBreak/>
+              <w:t>year (~₹21L–₹23L)</w:t>
+            </w:r>
+          </w:p>
+        </w:tc>
+        <w:tc>
+          <w:tcPr>
+            <w:tcW w:w="4500" w:type="dxa"/>
+            <w:tcBorders>
+              <w:top w:val="single" w:sz="4" w:space="0" w:color="CBD5E1"/>
+              <w:left w:val="single" w:sz="4" w:space="0" w:color="CBD5E1"/>
+              <w:bottom w:val="single" w:sz="4" w:space="0" w:color="CBD5E1"/>
+              <w:right w:val="single" w:sz="4" w:space="0" w:color="CBD5E1"/>
+            </w:tcBorders>
+            <w:shd w:val="clear" w:color="auto" w:fill="FFFFFF"/>
+          </w:tcPr>
+          <w:p>
+            <w:r>
+              <w:lastRenderedPageBreak/>
+              <w:t xml:space="preserve">100% Full Tuition Waiver + </w:t>
+            </w:r>
+            <w:r>
+              <w:lastRenderedPageBreak/>
+              <w:t>€8,500 Cash Grant</w:t>
             </w:r>
           </w:p>
         </w:tc>
@@ -1481,6 +1858,7 @@
     </w:tbl>
     <w:p>
       <w:r>
+        <w:lastRenderedPageBreak/>
         <w:t>For Indian students whose cumulative family income falls below the €23,000 ceiling:</w:t>
       </w:r>
     </w:p>
@@ -1515,8 +1893,25 @@
     <w:tbl>
       <w:tblPr>
         <w:tblW w:w="9000" w:type="dxa"/>
+        <w:tblInd w:w="10" w:type="dxa"/>
+        <w:tblCellMar>
+          <w:left w:w="10" w:type="dxa"/>
+          <w:right w:w="10" w:type="dxa"/>
+        </w:tblCellMar>
+        <w:tblLook w:val="04A0" w:firstRow="1" w:lastRow="0" w:firstColumn="1" w:lastColumn="0" w:noHBand="0" w:noVBand="1"/>
       </w:tblPr>
+      <w:tblGrid>
+        <w:gridCol w:w="3004"/>
+        <w:gridCol w:w="2960"/>
+        <w:gridCol w:w="3036"/>
+      </w:tblGrid>
       <w:tr>
+        <w:tblPrEx>
+          <w:tblCellMar>
+            <w:top w:w="0" w:type="dxa"/>
+            <w:bottom w:w="0" w:type="dxa"/>
+          </w:tblCellMar>
+        </w:tblPrEx>
         <w:tc>
           <w:tcPr>
             <w:tcW w:w="4500" w:type="dxa"/>
@@ -1582,22 +1977,25 @@
         </w:tc>
       </w:tr>
       <w:tr>
-        <w:tc>
-          <w:tcPr>
-            <w:tcW w:w="4500" w:type="dxa"/>
-            <w:tcBorders>
-              <w:top w:val="single" w:sz="4" w:space="0" w:color="CBD5E1"/>
-              <w:left w:val="single" w:sz="4" w:space="0" w:color="CBD5E1"/>
-              <w:bottom w:val="single" w:sz="4" w:space="0" w:color="CBD5E1"/>
-              <w:right w:val="single" w:sz="4" w:space="0" w:color="CBD5E1"/>
-            </w:tcBorders>
-            <w:shd w:val="clear" w:color="auto" w:fill="FFFFFF"/>
-          </w:tcPr>
-          <w:p>
-            <w:r>
-              <w:rPr>
-                <w:color w:val="1E293B"/>
-              </w:rPr>
+        <w:tblPrEx>
+          <w:tblCellMar>
+            <w:top w:w="0" w:type="dxa"/>
+            <w:bottom w:w="0" w:type="dxa"/>
+          </w:tblCellMar>
+        </w:tblPrEx>
+        <w:tc>
+          <w:tcPr>
+            <w:tcW w:w="4500" w:type="dxa"/>
+            <w:tcBorders>
+              <w:top w:val="single" w:sz="4" w:space="0" w:color="CBD5E1"/>
+              <w:left w:val="single" w:sz="4" w:space="0" w:color="CBD5E1"/>
+              <w:bottom w:val="single" w:sz="4" w:space="0" w:color="CBD5E1"/>
+              <w:right w:val="single" w:sz="4" w:space="0" w:color="CBD5E1"/>
+            </w:tcBorders>
+            <w:shd w:val="clear" w:color="auto" w:fill="FFFFFF"/>
+          </w:tcPr>
+          <w:p>
+            <w:r>
               <w:t>Gross Tuition Cost</w:t>
             </w:r>
           </w:p>
@@ -1615,9 +2013,6 @@
           </w:tcPr>
           <w:p>
             <w:r>
-              <w:rPr>
-                <w:color w:val="1E293B"/>
-              </w:rPr>
               <w:t>₹20 Lakhs to ₹45 Lakhs / year</w:t>
             </w:r>
           </w:p>
@@ -1635,31 +2030,31 @@
           </w:tcPr>
           <w:p>
             <w:r>
-              <w:rPr>
-                <w:color w:val="1E293B"/>
-              </w:rPr>
               <w:t>₹0 (100% Statutorily Free / Waived)</w:t>
             </w:r>
           </w:p>
         </w:tc>
       </w:tr>
       <w:tr>
-        <w:tc>
-          <w:tcPr>
-            <w:tcW w:w="4500" w:type="dxa"/>
-            <w:tcBorders>
-              <w:top w:val="single" w:sz="4" w:space="0" w:color="CBD5E1"/>
-              <w:left w:val="single" w:sz="4" w:space="0" w:color="CBD5E1"/>
-              <w:bottom w:val="single" w:sz="4" w:space="0" w:color="CBD5E1"/>
-              <w:right w:val="single" w:sz="4" w:space="0" w:color="CBD5E1"/>
-            </w:tcBorders>
-            <w:shd w:val="clear" w:color="auto" w:fill="FFFFFF"/>
-          </w:tcPr>
-          <w:p>
-            <w:r>
-              <w:rPr>
-                <w:color w:val="1E293B"/>
-              </w:rPr>
+        <w:tblPrEx>
+          <w:tblCellMar>
+            <w:top w:w="0" w:type="dxa"/>
+            <w:bottom w:w="0" w:type="dxa"/>
+          </w:tblCellMar>
+        </w:tblPrEx>
+        <w:tc>
+          <w:tcPr>
+            <w:tcW w:w="4500" w:type="dxa"/>
+            <w:tcBorders>
+              <w:top w:val="single" w:sz="4" w:space="0" w:color="CBD5E1"/>
+              <w:left w:val="single" w:sz="4" w:space="0" w:color="CBD5E1"/>
+              <w:bottom w:val="single" w:sz="4" w:space="0" w:color="CBD5E1"/>
+              <w:right w:val="single" w:sz="4" w:space="0" w:color="CBD5E1"/>
+            </w:tcBorders>
+            <w:shd w:val="clear" w:color="auto" w:fill="FFFFFF"/>
+          </w:tcPr>
+          <w:p>
+            <w:r>
               <w:t>Required Educational Debt</w:t>
             </w:r>
           </w:p>
@@ -1677,9 +2072,6 @@
           </w:tcPr>
           <w:p>
             <w:r>
-              <w:rPr>
-                <w:color w:val="1E293B"/>
-              </w:rPr>
               <w:t>₹50 Lakhs to ₹70 Lakhs (at 13.5% Floating)</w:t>
             </w:r>
           </w:p>
@@ -1697,31 +2089,31 @@
           </w:tcPr>
           <w:p>
             <w:r>
-              <w:rPr>
-                <w:color w:val="1E293B"/>
-              </w:rPr>
               <w:t>₹0 to ₹10 Lakhs (Debt-Free Education)</w:t>
             </w:r>
           </w:p>
         </w:tc>
       </w:tr>
       <w:tr>
-        <w:tc>
-          <w:tcPr>
-            <w:tcW w:w="4500" w:type="dxa"/>
-            <w:tcBorders>
-              <w:top w:val="single" w:sz="4" w:space="0" w:color="CBD5E1"/>
-              <w:left w:val="single" w:sz="4" w:space="0" w:color="CBD5E1"/>
-              <w:bottom w:val="single" w:sz="4" w:space="0" w:color="CBD5E1"/>
-              <w:right w:val="single" w:sz="4" w:space="0" w:color="CBD5E1"/>
-            </w:tcBorders>
-            <w:shd w:val="clear" w:color="auto" w:fill="FFFFFF"/>
-          </w:tcPr>
-          <w:p>
-            <w:r>
-              <w:rPr>
-                <w:color w:val="1E293B"/>
-              </w:rPr>
+        <w:tblPrEx>
+          <w:tblCellMar>
+            <w:top w:w="0" w:type="dxa"/>
+            <w:bottom w:w="0" w:type="dxa"/>
+          </w:tblCellMar>
+        </w:tblPrEx>
+        <w:tc>
+          <w:tcPr>
+            <w:tcW w:w="4500" w:type="dxa"/>
+            <w:tcBorders>
+              <w:top w:val="single" w:sz="4" w:space="0" w:color="CBD5E1"/>
+              <w:left w:val="single" w:sz="4" w:space="0" w:color="CBD5E1"/>
+              <w:bottom w:val="single" w:sz="4" w:space="0" w:color="CBD5E1"/>
+              <w:right w:val="single" w:sz="4" w:space="0" w:color="CBD5E1"/>
+            </w:tcBorders>
+            <w:shd w:val="clear" w:color="auto" w:fill="FFFFFF"/>
+          </w:tcPr>
+          <w:p>
+            <w:r>
               <w:t>Direct Living Grants</w:t>
             </w:r>
           </w:p>
@@ -1739,9 +2131,6 @@
           </w:tcPr>
           <w:p>
             <w:r>
-              <w:rPr>
-                <w:color w:val="1E293B"/>
-              </w:rPr>
               <w:t>Negligible / None</w:t>
             </w:r>
           </w:p>
@@ -1759,31 +2148,31 @@
           </w:tcPr>
           <w:p>
             <w:r>
-              <w:rPr>
-                <w:color w:val="1E293B"/>
-              </w:rPr>
               <w:t>€7,000 to €8,500 Cash Stipend (Italy DSU)</w:t>
             </w:r>
           </w:p>
         </w:tc>
       </w:tr>
       <w:tr>
-        <w:tc>
-          <w:tcPr>
-            <w:tcW w:w="4500" w:type="dxa"/>
-            <w:tcBorders>
-              <w:top w:val="single" w:sz="4" w:space="0" w:color="CBD5E1"/>
-              <w:left w:val="single" w:sz="4" w:space="0" w:color="CBD5E1"/>
-              <w:bottom w:val="single" w:sz="4" w:space="0" w:color="CBD5E1"/>
-              <w:right w:val="single" w:sz="4" w:space="0" w:color="CBD5E1"/>
-            </w:tcBorders>
-            <w:shd w:val="clear" w:color="auto" w:fill="FFFFFF"/>
-          </w:tcPr>
-          <w:p>
-            <w:r>
-              <w:rPr>
-                <w:color w:val="1E293B"/>
-              </w:rPr>
+        <w:tblPrEx>
+          <w:tblCellMar>
+            <w:top w:w="0" w:type="dxa"/>
+            <w:bottom w:w="0" w:type="dxa"/>
+          </w:tblCellMar>
+        </w:tblPrEx>
+        <w:tc>
+          <w:tcPr>
+            <w:tcW w:w="4500" w:type="dxa"/>
+            <w:tcBorders>
+              <w:top w:val="single" w:sz="4" w:space="0" w:color="CBD5E1"/>
+              <w:left w:val="single" w:sz="4" w:space="0" w:color="CBD5E1"/>
+              <w:bottom w:val="single" w:sz="4" w:space="0" w:color="CBD5E1"/>
+              <w:right w:val="single" w:sz="4" w:space="0" w:color="CBD5E1"/>
+            </w:tcBorders>
+            <w:shd w:val="clear" w:color="auto" w:fill="FFFFFF"/>
+          </w:tcPr>
+          <w:p>
+            <w:r>
               <w:t>Institutional Age &amp; Pedigree</w:t>
             </w:r>
           </w:p>
@@ -1801,9 +2190,6 @@
           </w:tcPr>
           <w:p>
             <w:r>
-              <w:rPr>
-                <w:color w:val="1E293B"/>
-              </w:rPr>
               <w:t>Commercial strip-mall / private career colleges</w:t>
             </w:r>
           </w:p>
@@ -1821,31 +2207,39 @@
           </w:tcPr>
           <w:p>
             <w:r>
-              <w:rPr>
-                <w:color w:val="1E293B"/>
-              </w:rPr>
-              <w:t>500–800 Year Old Elite Public State Universities</w:t>
+              <w:t>500–</w:t>
+            </w:r>
+            <w:proofErr w:type="gramStart"/>
+            <w:r>
+              <w:t>800 Year Old</w:t>
+            </w:r>
+            <w:proofErr w:type="gramEnd"/>
+            <w:r>
+              <w:t xml:space="preserve"> Elite Public State Universities</w:t>
             </w:r>
           </w:p>
         </w:tc>
       </w:tr>
       <w:tr>
-        <w:tc>
-          <w:tcPr>
-            <w:tcW w:w="4500" w:type="dxa"/>
-            <w:tcBorders>
-              <w:top w:val="single" w:sz="4" w:space="0" w:color="CBD5E1"/>
-              <w:left w:val="single" w:sz="4" w:space="0" w:color="CBD5E1"/>
-              <w:bottom w:val="single" w:sz="4" w:space="0" w:color="CBD5E1"/>
-              <w:right w:val="single" w:sz="4" w:space="0" w:color="CBD5E1"/>
-            </w:tcBorders>
-            <w:shd w:val="clear" w:color="auto" w:fill="FFFFFF"/>
-          </w:tcPr>
-          <w:p>
-            <w:r>
-              <w:rPr>
-                <w:color w:val="1E293B"/>
-              </w:rPr>
+        <w:tblPrEx>
+          <w:tblCellMar>
+            <w:top w:w="0" w:type="dxa"/>
+            <w:bottom w:w="0" w:type="dxa"/>
+          </w:tblCellMar>
+        </w:tblPrEx>
+        <w:tc>
+          <w:tcPr>
+            <w:tcW w:w="4500" w:type="dxa"/>
+            <w:tcBorders>
+              <w:top w:val="single" w:sz="4" w:space="0" w:color="CBD5E1"/>
+              <w:left w:val="single" w:sz="4" w:space="0" w:color="CBD5E1"/>
+              <w:bottom w:val="single" w:sz="4" w:space="0" w:color="CBD5E1"/>
+              <w:right w:val="single" w:sz="4" w:space="0" w:color="CBD5E1"/>
+            </w:tcBorders>
+            <w:shd w:val="clear" w:color="auto" w:fill="FFFFFF"/>
+          </w:tcPr>
+          <w:p>
+            <w:r>
               <w:t>Monthly Amortization (EMI)</w:t>
             </w:r>
           </w:p>
@@ -1863,9 +2257,6 @@
           </w:tcPr>
           <w:p>
             <w:r>
-              <w:rPr>
-                <w:color w:val="1E293B"/>
-              </w:rPr>
               <w:t>₹60,000 to ₹76,100 / month (10-year term)</w:t>
             </w:r>
           </w:p>
@@ -1883,31 +2274,31 @@
           </w:tcPr>
           <w:p>
             <w:r>
-              <w:rPr>
-                <w:color w:val="1E293B"/>
-              </w:rPr>
               <w:t>₹0 / month (Preserves family balance sheet)</w:t>
             </w:r>
           </w:p>
         </w:tc>
       </w:tr>
       <w:tr>
-        <w:tc>
-          <w:tcPr>
-            <w:tcW w:w="4500" w:type="dxa"/>
-            <w:tcBorders>
-              <w:top w:val="single" w:sz="4" w:space="0" w:color="CBD5E1"/>
-              <w:left w:val="single" w:sz="4" w:space="0" w:color="CBD5E1"/>
-              <w:bottom w:val="single" w:sz="4" w:space="0" w:color="CBD5E1"/>
-              <w:right w:val="single" w:sz="4" w:space="0" w:color="CBD5E1"/>
-            </w:tcBorders>
-            <w:shd w:val="clear" w:color="auto" w:fill="FFFFFF"/>
-          </w:tcPr>
-          <w:p>
-            <w:r>
-              <w:rPr>
-                <w:color w:val="1E293B"/>
-              </w:rPr>
+        <w:tblPrEx>
+          <w:tblCellMar>
+            <w:top w:w="0" w:type="dxa"/>
+            <w:bottom w:w="0" w:type="dxa"/>
+          </w:tblCellMar>
+        </w:tblPrEx>
+        <w:tc>
+          <w:tcPr>
+            <w:tcW w:w="4500" w:type="dxa"/>
+            <w:tcBorders>
+              <w:top w:val="single" w:sz="4" w:space="0" w:color="CBD5E1"/>
+              <w:left w:val="single" w:sz="4" w:space="0" w:color="CBD5E1"/>
+              <w:bottom w:val="single" w:sz="4" w:space="0" w:color="CBD5E1"/>
+              <w:right w:val="single" w:sz="4" w:space="0" w:color="CBD5E1"/>
+            </w:tcBorders>
+            <w:shd w:val="clear" w:color="auto" w:fill="FFFFFF"/>
+          </w:tcPr>
+          <w:p>
+            <w:r>
               <w:t>Post-Study Visa Framework</w:t>
             </w:r>
           </w:p>
@@ -1925,9 +2316,6 @@
           </w:tcPr>
           <w:p>
             <w:r>
-              <w:rPr>
-                <w:color w:val="1E293B"/>
-              </w:rPr>
               <w:t>Restrictive caps, wage floors (£38,700), PR barrier</w:t>
             </w:r>
           </w:p>
@@ -1945,31 +2333,36 @@
           </w:tcPr>
           <w:p>
             <w:r>
-              <w:rPr>
-                <w:color w:val="1E293B"/>
-              </w:rPr>
-              <w:t>18–24 Month Legal Job Search, Chancenkarte</w:t>
-            </w:r>
+              <w:t xml:space="preserve">18–24 Month Legal Job Search, </w:t>
+            </w:r>
+            <w:proofErr w:type="spellStart"/>
+            <w:r>
+              <w:t>Chancenkarte</w:t>
+            </w:r>
+            <w:proofErr w:type="spellEnd"/>
           </w:p>
         </w:tc>
       </w:tr>
       <w:tr>
-        <w:tc>
-          <w:tcPr>
-            <w:tcW w:w="4500" w:type="dxa"/>
-            <w:tcBorders>
-              <w:top w:val="single" w:sz="4" w:space="0" w:color="CBD5E1"/>
-              <w:left w:val="single" w:sz="4" w:space="0" w:color="CBD5E1"/>
-              <w:bottom w:val="single" w:sz="4" w:space="0" w:color="CBD5E1"/>
-              <w:right w:val="single" w:sz="4" w:space="0" w:color="CBD5E1"/>
-            </w:tcBorders>
-            <w:shd w:val="clear" w:color="auto" w:fill="FFFFFF"/>
-          </w:tcPr>
-          <w:p>
-            <w:r>
-              <w:rPr>
-                <w:color w:val="1E293B"/>
-              </w:rPr>
+        <w:tblPrEx>
+          <w:tblCellMar>
+            <w:top w:w="0" w:type="dxa"/>
+            <w:bottom w:w="0" w:type="dxa"/>
+          </w:tblCellMar>
+        </w:tblPrEx>
+        <w:tc>
+          <w:tcPr>
+            <w:tcW w:w="4500" w:type="dxa"/>
+            <w:tcBorders>
+              <w:top w:val="single" w:sz="4" w:space="0" w:color="CBD5E1"/>
+              <w:left w:val="single" w:sz="4" w:space="0" w:color="CBD5E1"/>
+              <w:bottom w:val="single" w:sz="4" w:space="0" w:color="CBD5E1"/>
+              <w:right w:val="single" w:sz="4" w:space="0" w:color="CBD5E1"/>
+            </w:tcBorders>
+            <w:shd w:val="clear" w:color="auto" w:fill="FFFFFF"/>
+          </w:tcPr>
+          <w:p>
+            <w:r>
               <w:t>Risk-Adjusted Expected Value (EV)</w:t>
             </w:r>
           </w:p>
@@ -1987,9 +2380,6 @@
           </w:tcPr>
           <w:p>
             <w:r>
-              <w:rPr>
-                <w:color w:val="1E293B"/>
-              </w:rPr>
               <w:t>Negative EV (High Downside Tail Risk)</w:t>
             </w:r>
           </w:p>
@@ -2007,9 +2397,6 @@
           </w:tcPr>
           <w:p>
             <w:r>
-              <w:rPr>
-                <w:color w:val="1E293B"/>
-              </w:rPr>
               <w:t>Asymmetric Positive Payoff (Zero Downside)</w:t>
             </w:r>
           </w:p>
@@ -2039,12 +2426,20 @@
         <w:pStyle w:val="Heading2"/>
       </w:pPr>
       <w:r>
-        <w:t>🎯 Primary Discipline Allocation Roadmap:</w:t>
-      </w:r>
-    </w:p>
-    <w:p>
-      <w:r>
-        <w:t>1. Path 1: STEM, Engineering, AI &amp; Data Science $\rightarrow$ Target Germany</w:t>
+        <w:t xml:space="preserve"> Primary Discipline Allocation Roadmap:</w:t>
+      </w:r>
+    </w:p>
+    <w:p>
+      <w:r>
+        <w:t>1. Path 1: STEM, Engineering, AI &amp; Data Science $\</w:t>
+      </w:r>
+      <w:proofErr w:type="spellStart"/>
+      <w:r>
+        <w:t>rightarrow</w:t>
+      </w:r>
+      <w:proofErr w:type="spellEnd"/>
+      <w:r>
+        <w:t>$ Target Germany</w:t>
       </w:r>
     </w:p>
     <w:p>
@@ -2056,7 +2451,7 @@
           <w:b/>
           <w:color w:val="0D9488"/>
         </w:rPr>
-        <w:t>✓ </w:t>
+        <w:t>✓</w:t>
       </w:r>
       <w:r>
         <w:t>Leverage zero-tuition public engineering institutions (TU9, Excellence Universities).</w:t>
@@ -2071,10 +2466,27 @@
           <w:b/>
           <w:color w:val="0D9488"/>
         </w:rPr>
-        <w:t>✓ </w:t>
-      </w:r>
-      <w:r>
-        <w:t>Clear the mandatory Akademische Prüfstelle (APS New Delhi) verification gate.</w:t>
+        <w:lastRenderedPageBreak/>
+        <w:t>✓</w:t>
+      </w:r>
+      <w:r>
+        <w:t xml:space="preserve">Clear the mandatory </w:t>
+      </w:r>
+      <w:proofErr w:type="spellStart"/>
+      <w:r>
+        <w:t>Akademische</w:t>
+      </w:r>
+      <w:proofErr w:type="spellEnd"/>
+      <w:r>
+        <w:t xml:space="preserve"> </w:t>
+      </w:r>
+      <w:proofErr w:type="spellStart"/>
+      <w:r>
+        <w:t>Prüfstelle</w:t>
+      </w:r>
+      <w:proofErr w:type="spellEnd"/>
+      <w:r>
+        <w:t xml:space="preserve"> (APS New Delhi) verification gate.</w:t>
       </w:r>
     </w:p>
     <w:p>
@@ -2086,7 +2498,7 @@
           <w:b/>
           <w:color w:val="0D9488"/>
         </w:rPr>
-        <w:t>✓ </w:t>
+        <w:t>✓</w:t>
       </w:r>
       <w:r>
         <w:t>Utilize the 18-month post-study work visa for seamless transition into German industrial corridors.</w:t>
@@ -2094,7 +2506,15 @@
     </w:p>
     <w:p>
       <w:r>
-        <w:t>2. Path 2: Management, Economics, Humanities &amp; Design $\rightarrow$ Target Italy</w:t>
+        <w:t>2. Path 2: Management, Economics, Humanities &amp; Design $\</w:t>
+      </w:r>
+      <w:proofErr w:type="spellStart"/>
+      <w:r>
+        <w:t>rightarrow</w:t>
+      </w:r>
+      <w:proofErr w:type="spellEnd"/>
+      <w:r>
+        <w:t>$ Target Italy</w:t>
       </w:r>
     </w:p>
     <w:p>
@@ -2106,10 +2526,18 @@
           <w:b/>
           <w:color w:val="0D9488"/>
         </w:rPr>
-        <w:t>✓ </w:t>
-      </w:r>
-      <w:r>
-        <w:t>Target centuries-old public research institutions (University of Bologna, Sapienza Rome, Politecnico di Milano).</w:t>
+        <w:t>✓</w:t>
+      </w:r>
+      <w:r>
+        <w:t xml:space="preserve">Target centuries-old public research institutions (University of Bologna, Sapienza Rome, </w:t>
+      </w:r>
+      <w:proofErr w:type="spellStart"/>
+      <w:r>
+        <w:t>Politecnico</w:t>
+      </w:r>
+      <w:proofErr w:type="spellEnd"/>
+      <w:r>
+        <w:t xml:space="preserve"> di Milano).</w:t>
       </w:r>
     </w:p>
     <w:p>
@@ -2121,10 +2549,18 @@
           <w:b/>
           <w:color w:val="0D9488"/>
         </w:rPr>
-        <w:t>✓ </w:t>
-      </w:r>
-      <w:r>
-        <w:t>Access 100% tuition fee waivers and up to €8,500 annual living stipends via the DSU ISEE Parificato framework.</w:t>
+        <w:t>✓</w:t>
+      </w:r>
+      <w:r>
+        <w:t xml:space="preserve">Access 100% tuition fee waivers and up to €8,500 annual living stipends via the DSU ISEE </w:t>
+      </w:r>
+      <w:proofErr w:type="spellStart"/>
+      <w:r>
+        <w:t>Parificato</w:t>
+      </w:r>
+      <w:proofErr w:type="spellEnd"/>
+      <w:r>
+        <w:t xml:space="preserve"> framework.</w:t>
       </w:r>
     </w:p>
     <w:p>
@@ -2136,7 +2572,7 @@
           <w:b/>
           <w:color w:val="0D9488"/>
         </w:rPr>
-        <w:t>✓ </w:t>
+        <w:t>✓</w:t>
       </w:r>
       <w:r>
         <w:t>Graduate debt-free with internationally recognized European ECTS master's credentials.</w:t>
@@ -2144,7 +2580,15 @@
     </w:p>
     <w:p>
       <w:r>
-        <w:t>3. Path 3: Medical Sciences (MBBS Abroad) $\rightarrow$ Target Continental European State Universities</w:t>
+        <w:t>3. Path 3: Medical Sciences (MBBS Abroad) $\</w:t>
+      </w:r>
+      <w:proofErr w:type="spellStart"/>
+      <w:r>
+        <w:t>rightarrow</w:t>
+      </w:r>
+      <w:proofErr w:type="spellEnd"/>
+      <w:r>
+        <w:t>$ Target Continental European State Universities</w:t>
       </w:r>
     </w:p>
     <w:p>
@@ -2156,7 +2600,7 @@
           <w:b/>
           <w:color w:val="0D9488"/>
         </w:rPr>
-        <w:t>✓ </w:t>
+        <w:t>✓</w:t>
       </w:r>
       <w:r>
         <w:t>Bypass predatory commercial agencies and avoid bilingual degree traps.</w:t>
@@ -2171,7 +2615,7 @@
           <w:b/>
           <w:color w:val="0D9488"/>
         </w:rPr>
-        <w:t>✓ </w:t>
+        <w:t>✓</w:t>
       </w:r>
       <w:r>
         <w:t>Select strictly NMC FMGL 2021-compliant (54-month academic + 12-month integrated institutional internship) single-cycle programs in European government universities.</w:t>
@@ -2186,7 +2630,7 @@
           <w:b/>
           <w:color w:val="0D9488"/>
         </w:rPr>
-        <w:t>✓ </w:t>
+        <w:t>✓</w:t>
       </w:r>
       <w:r>
         <w:t>Cap all-inclusive 6-year programmatic expenditure at ₹25 to ₹35 Lakhs total.</w:t>
@@ -2219,10 +2663,23 @@
           <w:b/>
           <w:color w:val="0D9488"/>
         </w:rPr>
-        <w:t>✓ </w:t>
-      </w:r>
-      <w:r>
-        <w:t>Akademische Prüfstelle (APS): Authorized processing for German academic verification.</w:t>
+        <w:t>✓</w:t>
+      </w:r>
+      <w:proofErr w:type="spellStart"/>
+      <w:r>
+        <w:t>Akademische</w:t>
+      </w:r>
+      <w:proofErr w:type="spellEnd"/>
+      <w:r>
+        <w:t xml:space="preserve"> </w:t>
+      </w:r>
+      <w:proofErr w:type="spellStart"/>
+      <w:r>
+        <w:t>Prüfstelle</w:t>
+      </w:r>
+      <w:proofErr w:type="spellEnd"/>
+      <w:r>
+        <w:t xml:space="preserve"> (APS): Authorized processing for German academic verification.</w:t>
       </w:r>
     </w:p>
     <w:p>
@@ -2234,7 +2691,7 @@
           <w:b/>
           <w:color w:val="0D9488"/>
         </w:rPr>
-        <w:t>✓ </w:t>
+        <w:t>✓</w:t>
       </w:r>
       <w:r>
         <w:t>Declaration of Value (DOV) &amp; CIMEA: Certified Italian consular and diplomatic legalization.</w:t>
@@ -2249,10 +2706,34 @@
           <w:b/>
           <w:color w:val="0D9488"/>
         </w:rPr>
-        <w:t>✓ </w:t>
-      </w:r>
-      <w:r>
-        <w:t>Regional DSU Portals: Direct submission of ISEE Parificato dossiers to regional Italian scholarship boards (DiscoLazio, ER.GO, EDISU).</w:t>
+        <w:t>✓</w:t>
+      </w:r>
+      <w:r>
+        <w:t xml:space="preserve">Regional DSU Portals: Direct submission of ISEE </w:t>
+      </w:r>
+      <w:proofErr w:type="spellStart"/>
+      <w:r>
+        <w:t>Parificato</w:t>
+      </w:r>
+      <w:proofErr w:type="spellEnd"/>
+      <w:r>
+        <w:t xml:space="preserve"> dossiers to regional Italian scholarship boards (</w:t>
+      </w:r>
+      <w:proofErr w:type="spellStart"/>
+      <w:r>
+        <w:t>DiscoLazio</w:t>
+      </w:r>
+      <w:proofErr w:type="spellEnd"/>
+      <w:r>
+        <w:t xml:space="preserve">, </w:t>
+      </w:r>
+      <w:proofErr w:type="gramStart"/>
+      <w:r>
+        <w:t>ER.GO</w:t>
+      </w:r>
+      <w:proofErr w:type="gramEnd"/>
+      <w:r>
+        <w:t>, EDISU).</w:t>
       </w:r>
     </w:p>
     <w:p>
@@ -2264,7 +2745,7 @@
           <w:b/>
           <w:color w:val="0D9488"/>
         </w:rPr>
-        <w:t>✓ </w:t>
+        <w:t>✓</w:t>
       </w:r>
       <w:r>
         <w:t>NMC FMGL 2021 Gazette Auditing: Legal compliance verification for international medical curricula.</w:t>
@@ -2275,7 +2756,7 @@
         <w:pStyle w:val="Heading2"/>
       </w:pPr>
       <w:r>
-        <w:t>🏁 Final Concluding Summary</w:t>
+        <w:t xml:space="preserve"> Final Concluding Summary</w:t>
       </w:r>
     </w:p>
     <w:p>
@@ -2298,7 +2779,7 @@
         <w:pStyle w:val="Heading2"/>
       </w:pPr>
       <w:r>
-        <w:t>📚 Sovereign Regulatory &amp; Academic Citations</w:t>
+        <w:t xml:space="preserve"> Sovereign Regulatory &amp; Academic Citations</w:t>
       </w:r>
     </w:p>
     <w:p>
@@ -2308,103 +2789,901 @@
     </w:p>
     <w:p>
       <w:r>
+        <w:lastRenderedPageBreak/>
         <w:t>2. UK Home Office: Statement of Changes in Immigration Rules (HC 590) &amp; Skilled Worker Minimum Salary Thresholds, UK Parliamentary Archives, 2024.</w:t>
       </w:r>
     </w:p>
     <w:p>
       <w:r>
-        <w:t>3. DAAD &amp; Destatis: Wissenschaft weltoffen 2026: Facts and Figures on the International Nature of Studies and Research in Germany, German Academic Exchange Service, Bonn.</w:t>
-      </w:r>
-    </w:p>
-    <w:p>
-      <w:r>
-        <w:t>4. Costituzione della Repubblica Italiana: Articolo 34 (Diritto allo Studio Universitario) &amp; Decreto Legislativo 29 marzo 2012, n. 68, Gazzetta Ufficiale della Repubblica Italiana.</w:t>
+        <w:t xml:space="preserve">3. DAAD &amp; </w:t>
+      </w:r>
+      <w:proofErr w:type="spellStart"/>
+      <w:r>
+        <w:t>Destatis</w:t>
+      </w:r>
+      <w:proofErr w:type="spellEnd"/>
+      <w:r>
+        <w:t xml:space="preserve">: Wissenschaft </w:t>
+      </w:r>
+      <w:proofErr w:type="spellStart"/>
+      <w:r>
+        <w:t>weltoffen</w:t>
+      </w:r>
+      <w:proofErr w:type="spellEnd"/>
+      <w:r>
+        <w:t xml:space="preserve"> 2026: Facts and Figures on the International Nature of Studies and Research in Germany, German Academic Exchange Service, Bonn.</w:t>
+      </w:r>
+    </w:p>
+    <w:p>
+      <w:r>
+        <w:t xml:space="preserve">4. </w:t>
+      </w:r>
+      <w:proofErr w:type="spellStart"/>
+      <w:r>
+        <w:t>Costituzione</w:t>
+      </w:r>
+      <w:proofErr w:type="spellEnd"/>
+      <w:r>
+        <w:t xml:space="preserve"> della Repubblica </w:t>
+      </w:r>
+      <w:proofErr w:type="spellStart"/>
+      <w:r>
+        <w:t>Italiana</w:t>
+      </w:r>
+      <w:proofErr w:type="spellEnd"/>
+      <w:r>
+        <w:t xml:space="preserve">: </w:t>
+      </w:r>
+      <w:proofErr w:type="spellStart"/>
+      <w:r>
+        <w:t>Articolo</w:t>
+      </w:r>
+      <w:proofErr w:type="spellEnd"/>
+      <w:r>
+        <w:t xml:space="preserve"> 34 (</w:t>
+      </w:r>
+      <w:proofErr w:type="spellStart"/>
+      <w:r>
+        <w:t>Diritto</w:t>
+      </w:r>
+      <w:proofErr w:type="spellEnd"/>
+      <w:r>
+        <w:t xml:space="preserve"> </w:t>
+      </w:r>
+      <w:proofErr w:type="spellStart"/>
+      <w:r>
+        <w:t>allo</w:t>
+      </w:r>
+      <w:proofErr w:type="spellEnd"/>
+      <w:r>
+        <w:t xml:space="preserve"> Studio Universitario) &amp; </w:t>
+      </w:r>
+      <w:proofErr w:type="spellStart"/>
+      <w:r>
+        <w:t>Decreto</w:t>
+      </w:r>
+      <w:proofErr w:type="spellEnd"/>
+      <w:r>
+        <w:t xml:space="preserve"> </w:t>
+      </w:r>
+      <w:proofErr w:type="spellStart"/>
+      <w:r>
+        <w:t>Legislativo</w:t>
+      </w:r>
+      <w:proofErr w:type="spellEnd"/>
+      <w:r>
+        <w:t xml:space="preserve"> 29 </w:t>
+      </w:r>
+      <w:proofErr w:type="spellStart"/>
+      <w:r>
+        <w:t>marzo</w:t>
+      </w:r>
+      <w:proofErr w:type="spellEnd"/>
+      <w:r>
+        <w:t xml:space="preserve"> 2012, n. 68, Gazzetta Ufficiale della Repubblica </w:t>
+      </w:r>
+      <w:proofErr w:type="spellStart"/>
+      <w:r>
+        <w:t>Italiana</w:t>
+      </w:r>
+      <w:proofErr w:type="spellEnd"/>
+      <w:r>
+        <w:t>.</w:t>
       </w:r>
     </w:p>
     <w:p>
       <w:r>
         <w:t>5. National Medical Commission (NMC): Foreign Medical Graduate Licentiate (FMGL) Regulations 2021, The Gazette of India: Extraordinary, Part III—Sec. 4.</w:t>
-      </w:r>
-    </w:p>
-    <w:p>
-      <w:pPr>
-        <w:pBdr>
-          <w:top w:val="single" w:sz="12" w:space="10" w:color="0D9488"/>
-        </w:pBdr>
-        <w:spacing w:before="300"/>
-      </w:pPr>
-      <w:r>
-        <w:rPr>
-          <w:b/>
-          <w:sz w:val="18"/>
-          <w:color w:val="0D9488"/>
-        </w:rPr>
-        <w:t>FINESSE OVERSEAS EDUCATION</w:t>
-      </w:r>
-      <w:r>
-        <w:rPr>
-          <w:sz w:val="18"/>
-          <w:color w:val="64748B"/>
-        </w:rPr>
-        <w:t> | Samarth Sakshi Plaza, 1st Floor, Rajarampuri 4th Lane, Kolhapur - 416008 | Direct Line: +91-9850069600 | Web: finesseoverseas.com</w:t>
       </w:r>
     </w:p>
     <w:sectPr>
       <w:pgSz w:w="11906" w:h="16838"/>
       <w:pgMar w:top="1134" w:right="1134" w:bottom="1134" w:left="1134" w:header="720" w:footer="720" w:gutter="0"/>
+      <w:cols w:space="720"/>
     </w:sectPr>
   </w:body>
 </w:document>
 </file>
 
 <file path=word/styles.xml><?xml version="1.0" encoding="utf-8"?>
-<w:styles xmlns:w="http://schemas.openxmlformats.org/wordprocessingml/2006/main">
+<w:styles xmlns:mc="http://schemas.openxmlformats.org/markup-compatibility/2006" xmlns:r="http://schemas.openxmlformats.org/officeDocument/2006/relationships" xmlns:w="http://schemas.openxmlformats.org/wordprocessingml/2006/main" xmlns:w14="http://schemas.microsoft.com/office/word/2010/wordml" xmlns:w15="http://schemas.microsoft.com/office/word/2012/wordml" xmlns:w16cex="http://schemas.microsoft.com/office/word/2018/wordml/cex" xmlns:w16cid="http://schemas.microsoft.com/office/word/2016/wordml/cid" xmlns:w16="http://schemas.microsoft.com/office/word/2018/wordml" xmlns:w16du="http://schemas.microsoft.com/office/word/2023/wordml/word16du" xmlns:w16sdtdh="http://schemas.microsoft.com/office/word/2020/wordml/sdtdatahash" xmlns:w16sdtfl="http://schemas.microsoft.com/office/word/2024/wordml/sdtformatlock" xmlns:w16se="http://schemas.microsoft.com/office/word/2015/wordml/symex" mc:Ignorable="w14 w15 w16se w16cid w16 w16cex w16sdtdh w16sdtfl w16du">
   <w:docDefaults>
     <w:rPrDefault>
       <w:rPr>
-        <w:rFonts w:ascii="Calibri" w:hAnsi="Calibri" w:cs="Calibri"/>
+        <w:rFonts w:ascii="Calibri" w:eastAsia="Times New Roman" w:hAnsi="Calibri" w:cs="Calibri"/>
+        <w:color w:val="1E293B"/>
         <w:sz w:val="22"/>
-        <w:color w:val="1E293B"/>
+        <w:lang w:val="en-IN" w:eastAsia="en-IN" w:bidi="mr-IN"/>
       </w:rPr>
     </w:rPrDefault>
     <w:pPrDefault>
       <w:pPr>
-        <w:spacing w:line="276" w:lineRule="auto" w:after="160"/>
+        <w:spacing w:after="160" w:line="276" w:lineRule="auto"/>
       </w:pPr>
     </w:pPrDefault>
   </w:docDefaults>
-  <w:style w:type="paragraph" w:styleId="Title">
-    <w:name w:val="Title"/>
-    <w:rPr>
-      <w:rFonts w:ascii="Calibri" w:hAnsi="Calibri"/>
-      <w:b/>
-      <w:sz w:val="38"/>
-      <w:color w:val="042F2E"/>
-    </w:rPr>
+  <w:latentStyles w:defLockedState="0" w:defUIPriority="99" w:defSemiHidden="0" w:defUnhideWhenUsed="0" w:defQFormat="0" w:count="376">
+    <w:lsdException w:name="Normal" w:uiPriority="0" w:qFormat="1"/>
+    <w:lsdException w:name="heading 1" w:uiPriority="9" w:qFormat="1"/>
+    <w:lsdException w:name="heading 2" w:semiHidden="1" w:uiPriority="9" w:unhideWhenUsed="1" w:qFormat="1"/>
+    <w:lsdException w:name="heading 3" w:semiHidden="1" w:uiPriority="9" w:unhideWhenUsed="1" w:qFormat="1"/>
+    <w:lsdException w:name="heading 4" w:semiHidden="1" w:uiPriority="9" w:unhideWhenUsed="1" w:qFormat="1"/>
+    <w:lsdException w:name="heading 5" w:semiHidden="1" w:uiPriority="9" w:unhideWhenUsed="1" w:qFormat="1"/>
+    <w:lsdException w:name="heading 6" w:semiHidden="1" w:uiPriority="9" w:unhideWhenUsed="1" w:qFormat="1"/>
+    <w:lsdException w:name="heading 7" w:semiHidden="1" w:uiPriority="9" w:unhideWhenUsed="1" w:qFormat="1"/>
+    <w:lsdException w:name="heading 8" w:semiHidden="1" w:uiPriority="9" w:unhideWhenUsed="1" w:qFormat="1"/>
+    <w:lsdException w:name="heading 9" w:semiHidden="1" w:uiPriority="9" w:unhideWhenUsed="1" w:qFormat="1"/>
+    <w:lsdException w:name="index 1" w:semiHidden="1" w:unhideWhenUsed="1"/>
+    <w:lsdException w:name="index 2" w:semiHidden="1" w:unhideWhenUsed="1"/>
+    <w:lsdException w:name="index 3" w:semiHidden="1" w:unhideWhenUsed="1"/>
+    <w:lsdException w:name="index 4" w:semiHidden="1" w:unhideWhenUsed="1"/>
+    <w:lsdException w:name="index 5" w:semiHidden="1" w:unhideWhenUsed="1"/>
+    <w:lsdException w:name="index 6" w:semiHidden="1" w:unhideWhenUsed="1"/>
+    <w:lsdException w:name="index 7" w:semiHidden="1" w:unhideWhenUsed="1"/>
+    <w:lsdException w:name="index 8" w:semiHidden="1" w:unhideWhenUsed="1"/>
+    <w:lsdException w:name="index 9" w:semiHidden="1" w:unhideWhenUsed="1"/>
+    <w:lsdException w:name="toc 1" w:semiHidden="1" w:uiPriority="39" w:unhideWhenUsed="1"/>
+    <w:lsdException w:name="toc 2" w:semiHidden="1" w:uiPriority="39" w:unhideWhenUsed="1"/>
+    <w:lsdException w:name="toc 3" w:semiHidden="1" w:uiPriority="39" w:unhideWhenUsed="1"/>
+    <w:lsdException w:name="toc 4" w:semiHidden="1" w:uiPriority="39" w:unhideWhenUsed="1"/>
+    <w:lsdException w:name="toc 5" w:semiHidden="1" w:uiPriority="39" w:unhideWhenUsed="1"/>
+    <w:lsdException w:name="toc 6" w:semiHidden="1" w:uiPriority="39" w:unhideWhenUsed="1"/>
+    <w:lsdException w:name="toc 7" w:semiHidden="1" w:uiPriority="39" w:unhideWhenUsed="1"/>
+    <w:lsdException w:name="toc 8" w:semiHidden="1" w:uiPriority="39" w:unhideWhenUsed="1"/>
+    <w:lsdException w:name="toc 9" w:semiHidden="1" w:uiPriority="39" w:unhideWhenUsed="1"/>
+    <w:lsdException w:name="Normal Indent" w:semiHidden="1" w:unhideWhenUsed="1"/>
+    <w:lsdException w:name="footnote text" w:semiHidden="1" w:unhideWhenUsed="1"/>
+    <w:lsdException w:name="annotation text" w:semiHidden="1" w:unhideWhenUsed="1"/>
+    <w:lsdException w:name="header" w:semiHidden="1" w:unhideWhenUsed="1"/>
+    <w:lsdException w:name="footer" w:semiHidden="1" w:unhideWhenUsed="1"/>
+    <w:lsdException w:name="index heading" w:semiHidden="1" w:unhideWhenUsed="1"/>
+    <w:lsdException w:name="caption" w:semiHidden="1" w:uiPriority="35" w:unhideWhenUsed="1" w:qFormat="1"/>
+    <w:lsdException w:name="table of figures" w:semiHidden="1" w:unhideWhenUsed="1"/>
+    <w:lsdException w:name="envelope address" w:semiHidden="1" w:unhideWhenUsed="1"/>
+    <w:lsdException w:name="envelope return" w:semiHidden="1" w:unhideWhenUsed="1"/>
+    <w:lsdException w:name="footnote reference" w:semiHidden="1" w:unhideWhenUsed="1"/>
+    <w:lsdException w:name="annotation reference" w:semiHidden="1" w:unhideWhenUsed="1"/>
+    <w:lsdException w:name="line number" w:semiHidden="1" w:unhideWhenUsed="1"/>
+    <w:lsdException w:name="page number" w:semiHidden="1" w:unhideWhenUsed="1"/>
+    <w:lsdException w:name="endnote reference" w:semiHidden="1" w:unhideWhenUsed="1"/>
+    <w:lsdException w:name="endnote text" w:semiHidden="1" w:unhideWhenUsed="1"/>
+    <w:lsdException w:name="table of authorities" w:semiHidden="1" w:unhideWhenUsed="1"/>
+    <w:lsdException w:name="macro" w:semiHidden="1" w:unhideWhenUsed="1"/>
+    <w:lsdException w:name="toa heading" w:semiHidden="1" w:unhideWhenUsed="1"/>
+    <w:lsdException w:name="List" w:semiHidden="1" w:unhideWhenUsed="1"/>
+    <w:lsdException w:name="List Bullet" w:semiHidden="1" w:unhideWhenUsed="1"/>
+    <w:lsdException w:name="List Number" w:semiHidden="1" w:unhideWhenUsed="1"/>
+    <w:lsdException w:name="List 2" w:semiHidden="1" w:unhideWhenUsed="1"/>
+    <w:lsdException w:name="List 3" w:semiHidden="1" w:unhideWhenUsed="1"/>
+    <w:lsdException w:name="List 4" w:semiHidden="1" w:unhideWhenUsed="1"/>
+    <w:lsdException w:name="List 5" w:semiHidden="1" w:unhideWhenUsed="1"/>
+    <w:lsdException w:name="List Bullet 2" w:semiHidden="1" w:unhideWhenUsed="1"/>
+    <w:lsdException w:name="List Bullet 3" w:semiHidden="1" w:unhideWhenUsed="1"/>
+    <w:lsdException w:name="List Bullet 4" w:semiHidden="1" w:unhideWhenUsed="1"/>
+    <w:lsdException w:name="List Bullet 5" w:semiHidden="1" w:unhideWhenUsed="1"/>
+    <w:lsdException w:name="List Number 2" w:semiHidden="1" w:unhideWhenUsed="1"/>
+    <w:lsdException w:name="List Number 3" w:semiHidden="1" w:unhideWhenUsed="1"/>
+    <w:lsdException w:name="List Number 4" w:semiHidden="1" w:unhideWhenUsed="1"/>
+    <w:lsdException w:name="List Number 5" w:semiHidden="1" w:unhideWhenUsed="1"/>
+    <w:lsdException w:name="Title" w:uiPriority="10" w:qFormat="1"/>
+    <w:lsdException w:name="Closing" w:semiHidden="1" w:unhideWhenUsed="1"/>
+    <w:lsdException w:name="Signature" w:semiHidden="1" w:unhideWhenUsed="1"/>
+    <w:lsdException w:name="Default Paragraph Font" w:semiHidden="1" w:uiPriority="1" w:unhideWhenUsed="1"/>
+    <w:lsdException w:name="Body Text" w:semiHidden="1" w:unhideWhenUsed="1"/>
+    <w:lsdException w:name="Body Text Indent" w:semiHidden="1" w:unhideWhenUsed="1"/>
+    <w:lsdException w:name="List Continue" w:semiHidden="1" w:unhideWhenUsed="1"/>
+    <w:lsdException w:name="List Continue 2" w:semiHidden="1" w:unhideWhenUsed="1"/>
+    <w:lsdException w:name="List Continue 3" w:semiHidden="1" w:unhideWhenUsed="1"/>
+    <w:lsdException w:name="List Continue 4" w:semiHidden="1" w:unhideWhenUsed="1"/>
+    <w:lsdException w:name="List Continue 5" w:semiHidden="1" w:unhideWhenUsed="1"/>
+    <w:lsdException w:name="Message Header" w:semiHidden="1" w:unhideWhenUsed="1"/>
+    <w:lsdException w:name="Subtitle" w:uiPriority="11" w:qFormat="1"/>
+    <w:lsdException w:name="Salutation" w:semiHidden="1" w:unhideWhenUsed="1"/>
+    <w:lsdException w:name="Date" w:semiHidden="1" w:unhideWhenUsed="1"/>
+    <w:lsdException w:name="Body Text First Indent" w:semiHidden="1" w:unhideWhenUsed="1"/>
+    <w:lsdException w:name="Body Text First Indent 2" w:semiHidden="1" w:unhideWhenUsed="1"/>
+    <w:lsdException w:name="Note Heading" w:semiHidden="1" w:unhideWhenUsed="1"/>
+    <w:lsdException w:name="Body Text 2" w:semiHidden="1" w:unhideWhenUsed="1"/>
+    <w:lsdException w:name="Body Text 3" w:semiHidden="1" w:unhideWhenUsed="1"/>
+    <w:lsdException w:name="Body Text Indent 2" w:semiHidden="1" w:unhideWhenUsed="1"/>
+    <w:lsdException w:name="Body Text Indent 3" w:semiHidden="1" w:unhideWhenUsed="1"/>
+    <w:lsdException w:name="Block Text" w:semiHidden="1" w:unhideWhenUsed="1"/>
+    <w:lsdException w:name="Hyperlink" w:semiHidden="1" w:unhideWhenUsed="1"/>
+    <w:lsdException w:name="FollowedHyperlink" w:semiHidden="1" w:unhideWhenUsed="1"/>
+    <w:lsdException w:name="Strong" w:uiPriority="22" w:qFormat="1"/>
+    <w:lsdException w:name="Emphasis" w:uiPriority="20" w:qFormat="1"/>
+    <w:lsdException w:name="Document Map" w:semiHidden="1" w:unhideWhenUsed="1"/>
+    <w:lsdException w:name="Plain Text" w:semiHidden="1" w:unhideWhenUsed="1"/>
+    <w:lsdException w:name="E-mail Signature" w:semiHidden="1" w:unhideWhenUsed="1"/>
+    <w:lsdException w:name="HTML Top of Form" w:semiHidden="1" w:unhideWhenUsed="1"/>
+    <w:lsdException w:name="HTML Bottom of Form" w:semiHidden="1" w:unhideWhenUsed="1"/>
+    <w:lsdException w:name="Normal (Web)" w:semiHidden="1" w:unhideWhenUsed="1"/>
+    <w:lsdException w:name="HTML Acronym" w:semiHidden="1" w:unhideWhenUsed="1"/>
+    <w:lsdException w:name="HTML Address" w:semiHidden="1" w:unhideWhenUsed="1"/>
+    <w:lsdException w:name="HTML Cite" w:semiHidden="1" w:unhideWhenUsed="1"/>
+    <w:lsdException w:name="HTML Code" w:semiHidden="1" w:unhideWhenUsed="1"/>
+    <w:lsdException w:name="HTML Definition" w:semiHidden="1" w:unhideWhenUsed="1"/>
+    <w:lsdException w:name="HTML Keyboard" w:semiHidden="1" w:unhideWhenUsed="1"/>
+    <w:lsdException w:name="HTML Preformatted" w:semiHidden="1" w:unhideWhenUsed="1"/>
+    <w:lsdException w:name="HTML Sample" w:semiHidden="1" w:unhideWhenUsed="1"/>
+    <w:lsdException w:name="HTML Typewriter" w:semiHidden="1" w:unhideWhenUsed="1"/>
+    <w:lsdException w:name="HTML Variable" w:semiHidden="1" w:unhideWhenUsed="1"/>
+    <w:lsdException w:name="Normal Table" w:semiHidden="1" w:unhideWhenUsed="1"/>
+    <w:lsdException w:name="annotation subject" w:semiHidden="1" w:unhideWhenUsed="1"/>
+    <w:lsdException w:name="No List" w:semiHidden="1" w:unhideWhenUsed="1"/>
+    <w:lsdException w:name="Outline List 1" w:semiHidden="1" w:unhideWhenUsed="1"/>
+    <w:lsdException w:name="Outline List 2" w:semiHidden="1" w:unhideWhenUsed="1"/>
+    <w:lsdException w:name="Outline List 3" w:semiHidden="1" w:unhideWhenUsed="1"/>
+    <w:lsdException w:name="Table Simple 1" w:semiHidden="1" w:unhideWhenUsed="1"/>
+    <w:lsdException w:name="Table Simple 2" w:semiHidden="1" w:unhideWhenUsed="1"/>
+    <w:lsdException w:name="Table Simple 3" w:semiHidden="1" w:unhideWhenUsed="1"/>
+    <w:lsdException w:name="Table Classic 1" w:semiHidden="1" w:unhideWhenUsed="1"/>
+    <w:lsdException w:name="Table Classic 2" w:semiHidden="1" w:unhideWhenUsed="1"/>
+    <w:lsdException w:name="Table Classic 3" w:semiHidden="1" w:unhideWhenUsed="1"/>
+    <w:lsdException w:name="Table Classic 4" w:semiHidden="1" w:unhideWhenUsed="1"/>
+    <w:lsdException w:name="Table Colorful 1" w:semiHidden="1" w:unhideWhenUsed="1"/>
+    <w:lsdException w:name="Table Colorful 2" w:semiHidden="1" w:unhideWhenUsed="1"/>
+    <w:lsdException w:name="Table Colorful 3" w:semiHidden="1" w:unhideWhenUsed="1"/>
+    <w:lsdException w:name="Table Columns 1" w:semiHidden="1" w:unhideWhenUsed="1"/>
+    <w:lsdException w:name="Table Columns 2" w:semiHidden="1" w:unhideWhenUsed="1"/>
+    <w:lsdException w:name="Table Columns 3" w:semiHidden="1" w:unhideWhenUsed="1"/>
+    <w:lsdException w:name="Table Columns 4" w:semiHidden="1" w:unhideWhenUsed="1"/>
+    <w:lsdException w:name="Table Columns 5" w:semiHidden="1" w:unhideWhenUsed="1"/>
+    <w:lsdException w:name="Table Grid 1" w:semiHidden="1" w:unhideWhenUsed="1"/>
+    <w:lsdException w:name="Table Grid 2" w:semiHidden="1" w:unhideWhenUsed="1"/>
+    <w:lsdException w:name="Table Grid 3" w:semiHidden="1" w:unhideWhenUsed="1"/>
+    <w:lsdException w:name="Table Grid 4" w:semiHidden="1" w:unhideWhenUsed="1"/>
+    <w:lsdException w:name="Table Grid 5" w:semiHidden="1" w:unhideWhenUsed="1"/>
+    <w:lsdException w:name="Table Grid 6" w:semiHidden="1" w:unhideWhenUsed="1"/>
+    <w:lsdException w:name="Table Grid 7" w:semiHidden="1" w:unhideWhenUsed="1"/>
+    <w:lsdException w:name="Table Grid 8" w:semiHidden="1" w:unhideWhenUsed="1"/>
+    <w:lsdException w:name="Table List 1" w:semiHidden="1" w:unhideWhenUsed="1"/>
+    <w:lsdException w:name="Table List 2" w:semiHidden="1" w:unhideWhenUsed="1"/>
+    <w:lsdException w:name="Table List 3" w:semiHidden="1" w:unhideWhenUsed="1"/>
+    <w:lsdException w:name="Table List 4" w:semiHidden="1" w:unhideWhenUsed="1"/>
+    <w:lsdException w:name="Table List 5" w:semiHidden="1" w:unhideWhenUsed="1"/>
+    <w:lsdException w:name="Table List 6" w:semiHidden="1" w:unhideWhenUsed="1"/>
+    <w:lsdException w:name="Table List 7" w:semiHidden="1" w:unhideWhenUsed="1"/>
+    <w:lsdException w:name="Table List 8" w:semiHidden="1" w:unhideWhenUsed="1"/>
+    <w:lsdException w:name="Table 3D effects 1" w:semiHidden="1" w:unhideWhenUsed="1"/>
+    <w:lsdException w:name="Table 3D effects 2" w:semiHidden="1" w:unhideWhenUsed="1"/>
+    <w:lsdException w:name="Table 3D effects 3" w:semiHidden="1" w:unhideWhenUsed="1"/>
+    <w:lsdException w:name="Table Contemporary" w:semiHidden="1" w:unhideWhenUsed="1"/>
+    <w:lsdException w:name="Table Elegant" w:semiHidden="1" w:unhideWhenUsed="1"/>
+    <w:lsdException w:name="Table Professional" w:semiHidden="1" w:unhideWhenUsed="1"/>
+    <w:lsdException w:name="Table Subtle 1" w:semiHidden="1" w:unhideWhenUsed="1"/>
+    <w:lsdException w:name="Table Subtle 2" w:semiHidden="1" w:unhideWhenUsed="1"/>
+    <w:lsdException w:name="Table Web 1" w:semiHidden="1" w:unhideWhenUsed="1"/>
+    <w:lsdException w:name="Table Web 2" w:semiHidden="1" w:unhideWhenUsed="1"/>
+    <w:lsdException w:name="Table Web 3" w:semiHidden="1" w:unhideWhenUsed="1"/>
+    <w:lsdException w:name="Balloon Text" w:semiHidden="1" w:unhideWhenUsed="1"/>
+    <w:lsdException w:name="Table Grid" w:uiPriority="39"/>
+    <w:lsdException w:name="Table Theme" w:semiHidden="1" w:unhideWhenUsed="1"/>
+    <w:lsdException w:name="Placeholder Text" w:semiHidden="1"/>
+    <w:lsdException w:name="No Spacing" w:uiPriority="1" w:qFormat="1"/>
+    <w:lsdException w:name="Light Shading" w:uiPriority="60"/>
+    <w:lsdException w:name="Light List" w:uiPriority="61"/>
+    <w:lsdException w:name="Light Grid" w:uiPriority="62"/>
+    <w:lsdException w:name="Medium Shading 1" w:uiPriority="63"/>
+    <w:lsdException w:name="Medium Shading 2" w:uiPriority="64"/>
+    <w:lsdException w:name="Medium List 1" w:uiPriority="65"/>
+    <w:lsdException w:name="Medium List 2" w:uiPriority="66"/>
+    <w:lsdException w:name="Medium Grid 1" w:uiPriority="67"/>
+    <w:lsdException w:name="Medium Grid 2" w:uiPriority="68"/>
+    <w:lsdException w:name="Medium Grid 3" w:uiPriority="69"/>
+    <w:lsdException w:name="Dark List" w:uiPriority="70"/>
+    <w:lsdException w:name="Colorful Shading" w:uiPriority="71"/>
+    <w:lsdException w:name="Colorful List" w:uiPriority="72"/>
+    <w:lsdException w:name="Colorful Grid" w:uiPriority="73"/>
+    <w:lsdException w:name="Light Shading Accent 1" w:uiPriority="60"/>
+    <w:lsdException w:name="Light List Accent 1" w:uiPriority="61"/>
+    <w:lsdException w:name="Light Grid Accent 1" w:uiPriority="62"/>
+    <w:lsdException w:name="Medium Shading 1 Accent 1" w:uiPriority="63"/>
+    <w:lsdException w:name="Medium Shading 2 Accent 1" w:uiPriority="64"/>
+    <w:lsdException w:name="Medium List 1 Accent 1" w:uiPriority="65"/>
+    <w:lsdException w:name="Revision" w:semiHidden="1"/>
+    <w:lsdException w:name="List Paragraph" w:uiPriority="34" w:qFormat="1"/>
+    <w:lsdException w:name="Quote" w:uiPriority="29" w:qFormat="1"/>
+    <w:lsdException w:name="Intense Quote" w:uiPriority="30" w:qFormat="1"/>
+    <w:lsdException w:name="Medium List 2 Accent 1" w:uiPriority="66"/>
+    <w:lsdException w:name="Medium Grid 1 Accent 1" w:uiPriority="67"/>
+    <w:lsdException w:name="Medium Grid 2 Accent 1" w:uiPriority="68"/>
+    <w:lsdException w:name="Medium Grid 3 Accent 1" w:uiPriority="69"/>
+    <w:lsdException w:name="Dark List Accent 1" w:uiPriority="70"/>
+    <w:lsdException w:name="Colorful Shading Accent 1" w:uiPriority="71"/>
+    <w:lsdException w:name="Colorful List Accent 1" w:uiPriority="72"/>
+    <w:lsdException w:name="Colorful Grid Accent 1" w:uiPriority="73"/>
+    <w:lsdException w:name="Light Shading Accent 2" w:uiPriority="60"/>
+    <w:lsdException w:name="Light List Accent 2" w:uiPriority="61"/>
+    <w:lsdException w:name="Light Grid Accent 2" w:uiPriority="62"/>
+    <w:lsdException w:name="Medium Shading 1 Accent 2" w:uiPriority="63"/>
+    <w:lsdException w:name="Medium Shading 2 Accent 2" w:uiPriority="64"/>
+    <w:lsdException w:name="Medium List 1 Accent 2" w:uiPriority="65"/>
+    <w:lsdException w:name="Medium List 2 Accent 2" w:uiPriority="66"/>
+    <w:lsdException w:name="Medium Grid 1 Accent 2" w:uiPriority="67"/>
+    <w:lsdException w:name="Medium Grid 2 Accent 2" w:uiPriority="68"/>
+    <w:lsdException w:name="Medium Grid 3 Accent 2" w:uiPriority="69"/>
+    <w:lsdException w:name="Dark List Accent 2" w:uiPriority="70"/>
+    <w:lsdException w:name="Colorful Shading Accent 2" w:uiPriority="71"/>
+    <w:lsdException w:name="Colorful List Accent 2" w:uiPriority="72"/>
+    <w:lsdException w:name="Colorful Grid Accent 2" w:uiPriority="73"/>
+    <w:lsdException w:name="Light Shading Accent 3" w:uiPriority="60"/>
+    <w:lsdException w:name="Light List Accent 3" w:uiPriority="61"/>
+    <w:lsdException w:name="Light Grid Accent 3" w:uiPriority="62"/>
+    <w:lsdException w:name="Medium Shading 1 Accent 3" w:uiPriority="63"/>
+    <w:lsdException w:name="Medium Shading 2 Accent 3" w:uiPriority="64"/>
+    <w:lsdException w:name="Medium List 1 Accent 3" w:uiPriority="65"/>
+    <w:lsdException w:name="Medium List 2 Accent 3" w:uiPriority="66"/>
+    <w:lsdException w:name="Medium Grid 1 Accent 3" w:uiPriority="67"/>
+    <w:lsdException w:name="Medium Grid 2 Accent 3" w:uiPriority="68"/>
+    <w:lsdException w:name="Medium Grid 3 Accent 3" w:uiPriority="69"/>
+    <w:lsdException w:name="Dark List Accent 3" w:uiPriority="70"/>
+    <w:lsdException w:name="Colorful Shading Accent 3" w:uiPriority="71"/>
+    <w:lsdException w:name="Colorful List Accent 3" w:uiPriority="72"/>
+    <w:lsdException w:name="Colorful Grid Accent 3" w:uiPriority="73"/>
+    <w:lsdException w:name="Light Shading Accent 4" w:uiPriority="60"/>
+    <w:lsdException w:name="Light List Accent 4" w:uiPriority="61"/>
+    <w:lsdException w:name="Light Grid Accent 4" w:uiPriority="62"/>
+    <w:lsdException w:name="Medium Shading 1 Accent 4" w:uiPriority="63"/>
+    <w:lsdException w:name="Medium Shading 2 Accent 4" w:uiPriority="64"/>
+    <w:lsdException w:name="Medium List 1 Accent 4" w:uiPriority="65"/>
+    <w:lsdException w:name="Medium List 2 Accent 4" w:uiPriority="66"/>
+    <w:lsdException w:name="Medium Grid 1 Accent 4" w:uiPriority="67"/>
+    <w:lsdException w:name="Medium Grid 2 Accent 4" w:uiPriority="68"/>
+    <w:lsdException w:name="Medium Grid 3 Accent 4" w:uiPriority="69"/>
+    <w:lsdException w:name="Dark List Accent 4" w:uiPriority="70"/>
+    <w:lsdException w:name="Colorful Shading Accent 4" w:uiPriority="71"/>
+    <w:lsdException w:name="Colorful List Accent 4" w:uiPriority="72"/>
+    <w:lsdException w:name="Colorful Grid Accent 4" w:uiPriority="73"/>
+    <w:lsdException w:name="Light Shading Accent 5" w:uiPriority="60"/>
+    <w:lsdException w:name="Light List Accent 5" w:uiPriority="61"/>
+    <w:lsdException w:name="Light Grid Accent 5" w:uiPriority="62"/>
+    <w:lsdException w:name="Medium Shading 1 Accent 5" w:uiPriority="63"/>
+    <w:lsdException w:name="Medium Shading 2 Accent 5" w:uiPriority="64"/>
+    <w:lsdException w:name="Medium List 1 Accent 5" w:uiPriority="65"/>
+    <w:lsdException w:name="Medium List 2 Accent 5" w:uiPriority="66"/>
+    <w:lsdException w:name="Medium Grid 1 Accent 5" w:uiPriority="67"/>
+    <w:lsdException w:name="Medium Grid 2 Accent 5" w:uiPriority="68"/>
+    <w:lsdException w:name="Medium Grid 3 Accent 5" w:uiPriority="69"/>
+    <w:lsdException w:name="Dark List Accent 5" w:uiPriority="70"/>
+    <w:lsdException w:name="Colorful Shading Accent 5" w:uiPriority="71"/>
+    <w:lsdException w:name="Colorful List Accent 5" w:uiPriority="72"/>
+    <w:lsdException w:name="Colorful Grid Accent 5" w:uiPriority="73"/>
+    <w:lsdException w:name="Light Shading Accent 6" w:uiPriority="60"/>
+    <w:lsdException w:name="Light List Accent 6" w:uiPriority="61"/>
+    <w:lsdException w:name="Light Grid Accent 6" w:uiPriority="62"/>
+    <w:lsdException w:name="Medium Shading 1 Accent 6" w:uiPriority="63"/>
+    <w:lsdException w:name="Medium Shading 2 Accent 6" w:uiPriority="64"/>
+    <w:lsdException w:name="Medium List 1 Accent 6" w:uiPriority="65"/>
+    <w:lsdException w:name="Medium List 2 Accent 6" w:uiPriority="66"/>
+    <w:lsdException w:name="Medium Grid 1 Accent 6" w:uiPriority="67"/>
+    <w:lsdException w:name="Medium Grid 2 Accent 6" w:uiPriority="68"/>
+    <w:lsdException w:name="Medium Grid 3 Accent 6" w:uiPriority="69"/>
+    <w:lsdException w:name="Dark List Accent 6" w:uiPriority="70"/>
+    <w:lsdException w:name="Colorful Shading Accent 6" w:uiPriority="71"/>
+    <w:lsdException w:name="Colorful List Accent 6" w:uiPriority="72"/>
+    <w:lsdException w:name="Colorful Grid Accent 6" w:uiPriority="73"/>
+    <w:lsdException w:name="Subtle Emphasis" w:uiPriority="19" w:qFormat="1"/>
+    <w:lsdException w:name="Intense Emphasis" w:uiPriority="21" w:qFormat="1"/>
+    <w:lsdException w:name="Subtle Reference" w:uiPriority="31" w:qFormat="1"/>
+    <w:lsdException w:name="Intense Reference" w:uiPriority="32" w:qFormat="1"/>
+    <w:lsdException w:name="Book Title" w:uiPriority="33" w:qFormat="1"/>
+    <w:lsdException w:name="Bibliography" w:semiHidden="1" w:uiPriority="37" w:unhideWhenUsed="1"/>
+    <w:lsdException w:name="TOC Heading" w:semiHidden="1" w:uiPriority="39" w:unhideWhenUsed="1" w:qFormat="1"/>
+    <w:lsdException w:name="Plain Table 1" w:uiPriority="41"/>
+    <w:lsdException w:name="Plain Table 2" w:uiPriority="42"/>
+    <w:lsdException w:name="Plain Table 3" w:uiPriority="43"/>
+    <w:lsdException w:name="Plain Table 4" w:uiPriority="44"/>
+    <w:lsdException w:name="Plain Table 5" w:uiPriority="45"/>
+    <w:lsdException w:name="Grid Table Light" w:uiPriority="40"/>
+    <w:lsdException w:name="Grid Table 1 Light" w:uiPriority="46"/>
+    <w:lsdException w:name="Grid Table 2" w:uiPriority="47"/>
+    <w:lsdException w:name="Grid Table 3" w:uiPriority="48"/>
+    <w:lsdException w:name="Grid Table 4" w:uiPriority="49"/>
+    <w:lsdException w:name="Grid Table 5 Dark" w:uiPriority="50"/>
+    <w:lsdException w:name="Grid Table 6 Colorful" w:uiPriority="51"/>
+    <w:lsdException w:name="Grid Table 7 Colorful" w:uiPriority="52"/>
+    <w:lsdException w:name="Grid Table 1 Light Accent 1" w:uiPriority="46"/>
+    <w:lsdException w:name="Grid Table 2 Accent 1" w:uiPriority="47"/>
+    <w:lsdException w:name="Grid Table 3 Accent 1" w:uiPriority="48"/>
+    <w:lsdException w:name="Grid Table 4 Accent 1" w:uiPriority="49"/>
+    <w:lsdException w:name="Grid Table 5 Dark Accent 1" w:uiPriority="50"/>
+    <w:lsdException w:name="Grid Table 6 Colorful Accent 1" w:uiPriority="51"/>
+    <w:lsdException w:name="Grid Table 7 Colorful Accent 1" w:uiPriority="52"/>
+    <w:lsdException w:name="Grid Table 1 Light Accent 2" w:uiPriority="46"/>
+    <w:lsdException w:name="Grid Table 2 Accent 2" w:uiPriority="47"/>
+    <w:lsdException w:name="Grid Table 3 Accent 2" w:uiPriority="48"/>
+    <w:lsdException w:name="Grid Table 4 Accent 2" w:uiPriority="49"/>
+    <w:lsdException w:name="Grid Table 5 Dark Accent 2" w:uiPriority="50"/>
+    <w:lsdException w:name="Grid Table 6 Colorful Accent 2" w:uiPriority="51"/>
+    <w:lsdException w:name="Grid Table 7 Colorful Accent 2" w:uiPriority="52"/>
+    <w:lsdException w:name="Grid Table 1 Light Accent 3" w:uiPriority="46"/>
+    <w:lsdException w:name="Grid Table 2 Accent 3" w:uiPriority="47"/>
+    <w:lsdException w:name="Grid Table 3 Accent 3" w:uiPriority="48"/>
+    <w:lsdException w:name="Grid Table 4 Accent 3" w:uiPriority="49"/>
+    <w:lsdException w:name="Grid Table 5 Dark Accent 3" w:uiPriority="50"/>
+    <w:lsdException w:name="Grid Table 6 Colorful Accent 3" w:uiPriority="51"/>
+    <w:lsdException w:name="Grid Table 7 Colorful Accent 3" w:uiPriority="52"/>
+    <w:lsdException w:name="Grid Table 1 Light Accent 4" w:uiPriority="46"/>
+    <w:lsdException w:name="Grid Table 2 Accent 4" w:uiPriority="47"/>
+    <w:lsdException w:name="Grid Table 3 Accent 4" w:uiPriority="48"/>
+    <w:lsdException w:name="Grid Table 4 Accent 4" w:uiPriority="49"/>
+    <w:lsdException w:name="Grid Table 5 Dark Accent 4" w:uiPriority="50"/>
+    <w:lsdException w:name="Grid Table 6 Colorful Accent 4" w:uiPriority="51"/>
+    <w:lsdException w:name="Grid Table 7 Colorful Accent 4" w:uiPriority="52"/>
+    <w:lsdException w:name="Grid Table 1 Light Accent 5" w:uiPriority="46"/>
+    <w:lsdException w:name="Grid Table 2 Accent 5" w:uiPriority="47"/>
+    <w:lsdException w:name="Grid Table 3 Accent 5" w:uiPriority="48"/>
+    <w:lsdException w:name="Grid Table 4 Accent 5" w:uiPriority="49"/>
+    <w:lsdException w:name="Grid Table 5 Dark Accent 5" w:uiPriority="50"/>
+    <w:lsdException w:name="Grid Table 6 Colorful Accent 5" w:uiPriority="51"/>
+    <w:lsdException w:name="Grid Table 7 Colorful Accent 5" w:uiPriority="52"/>
+    <w:lsdException w:name="Grid Table 1 Light Accent 6" w:uiPriority="46"/>
+    <w:lsdException w:name="Grid Table 2 Accent 6" w:uiPriority="47"/>
+    <w:lsdException w:name="Grid Table 3 Accent 6" w:uiPriority="48"/>
+    <w:lsdException w:name="Grid Table 4 Accent 6" w:uiPriority="49"/>
+    <w:lsdException w:name="Grid Table 5 Dark Accent 6" w:uiPriority="50"/>
+    <w:lsdException w:name="Grid Table 6 Colorful Accent 6" w:uiPriority="51"/>
+    <w:lsdException w:name="Grid Table 7 Colorful Accent 6" w:uiPriority="52"/>
+    <w:lsdException w:name="List Table 1 Light" w:uiPriority="46"/>
+    <w:lsdException w:name="List Table 2" w:uiPriority="47"/>
+    <w:lsdException w:name="List Table 3" w:uiPriority="48"/>
+    <w:lsdException w:name="List Table 4" w:uiPriority="49"/>
+    <w:lsdException w:name="List Table 5 Dark" w:uiPriority="50"/>
+    <w:lsdException w:name="List Table 6 Colorful" w:uiPriority="51"/>
+    <w:lsdException w:name="List Table 7 Colorful" w:uiPriority="52"/>
+    <w:lsdException w:name="List Table 1 Light Accent 1" w:uiPriority="46"/>
+    <w:lsdException w:name="List Table 2 Accent 1" w:uiPriority="47"/>
+    <w:lsdException w:name="List Table 3 Accent 1" w:uiPriority="48"/>
+    <w:lsdException w:name="List Table 4 Accent 1" w:uiPriority="49"/>
+    <w:lsdException w:name="List Table 5 Dark Accent 1" w:uiPriority="50"/>
+    <w:lsdException w:name="List Table 6 Colorful Accent 1" w:uiPriority="51"/>
+    <w:lsdException w:name="List Table 7 Colorful Accent 1" w:uiPriority="52"/>
+    <w:lsdException w:name="List Table 1 Light Accent 2" w:uiPriority="46"/>
+    <w:lsdException w:name="List Table 2 Accent 2" w:uiPriority="47"/>
+    <w:lsdException w:name="List Table 3 Accent 2" w:uiPriority="48"/>
+    <w:lsdException w:name="List Table 4 Accent 2" w:uiPriority="49"/>
+    <w:lsdException w:name="List Table 5 Dark Accent 2" w:uiPriority="50"/>
+    <w:lsdException w:name="List Table 6 Colorful Accent 2" w:uiPriority="51"/>
+    <w:lsdException w:name="List Table 7 Colorful Accent 2" w:uiPriority="52"/>
+    <w:lsdException w:name="List Table 1 Light Accent 3" w:uiPriority="46"/>
+    <w:lsdException w:name="List Table 2 Accent 3" w:uiPriority="47"/>
+    <w:lsdException w:name="List Table 3 Accent 3" w:uiPriority="48"/>
+    <w:lsdException w:name="List Table 4 Accent 3" w:uiPriority="49"/>
+    <w:lsdException w:name="List Table 5 Dark Accent 3" w:uiPriority="50"/>
+    <w:lsdException w:name="List Table 6 Colorful Accent 3" w:uiPriority="51"/>
+    <w:lsdException w:name="List Table 7 Colorful Accent 3" w:uiPriority="52"/>
+    <w:lsdException w:name="List Table 1 Light Accent 4" w:uiPriority="46"/>
+    <w:lsdException w:name="List Table 2 Accent 4" w:uiPriority="47"/>
+    <w:lsdException w:name="List Table 3 Accent 4" w:uiPriority="48"/>
+    <w:lsdException w:name="List Table 4 Accent 4" w:uiPriority="49"/>
+    <w:lsdException w:name="List Table 5 Dark Accent 4" w:uiPriority="50"/>
+    <w:lsdException w:name="List Table 6 Colorful Accent 4" w:uiPriority="51"/>
+    <w:lsdException w:name="List Table 7 Colorful Accent 4" w:uiPriority="52"/>
+    <w:lsdException w:name="List Table 1 Light Accent 5" w:uiPriority="46"/>
+    <w:lsdException w:name="List Table 2 Accent 5" w:uiPriority="47"/>
+    <w:lsdException w:name="List Table 3 Accent 5" w:uiPriority="48"/>
+    <w:lsdException w:name="List Table 4 Accent 5" w:uiPriority="49"/>
+    <w:lsdException w:name="List Table 5 Dark Accent 5" w:uiPriority="50"/>
+    <w:lsdException w:name="List Table 6 Colorful Accent 5" w:uiPriority="51"/>
+    <w:lsdException w:name="List Table 7 Colorful Accent 5" w:uiPriority="52"/>
+    <w:lsdException w:name="List Table 1 Light Accent 6" w:uiPriority="46"/>
+    <w:lsdException w:name="List Table 2 Accent 6" w:uiPriority="47"/>
+    <w:lsdException w:name="List Table 3 Accent 6" w:uiPriority="48"/>
+    <w:lsdException w:name="List Table 4 Accent 6" w:uiPriority="49"/>
+    <w:lsdException w:name="List Table 5 Dark Accent 6" w:uiPriority="50"/>
+    <w:lsdException w:name="List Table 6 Colorful Accent 6" w:uiPriority="51"/>
+    <w:lsdException w:name="List Table 7 Colorful Accent 6" w:uiPriority="52"/>
+    <w:lsdException w:name="Mention" w:semiHidden="1" w:unhideWhenUsed="1"/>
+    <w:lsdException w:name="Smart Hyperlink" w:semiHidden="1" w:unhideWhenUsed="1"/>
+    <w:lsdException w:name="Hashtag" w:semiHidden="1" w:unhideWhenUsed="1"/>
+    <w:lsdException w:name="Unresolved Mention" w:semiHidden="1" w:unhideWhenUsed="1"/>
+    <w:lsdException w:name="Smart Link" w:semiHidden="1" w:unhideWhenUsed="1"/>
+  </w:latentStyles>
+  <w:style w:type="paragraph" w:default="1" w:styleId="Normal">
+    <w:name w:val="Normal"/>
+    <w:qFormat/>
   </w:style>
   <w:style w:type="paragraph" w:styleId="Heading1">
     <w:name w:val="heading 1"/>
+    <w:uiPriority w:val="9"/>
+    <w:qFormat/>
     <w:pPr>
       <w:spacing w:before="280" w:after="140"/>
+      <w:outlineLvl w:val="0"/>
     </w:pPr>
     <w:rPr>
-      <w:rFonts w:ascii="Calibri" w:hAnsi="Calibri"/>
       <w:b/>
+      <w:color w:val="0F766E"/>
       <w:sz w:val="28"/>
-      <w:color w:val="0F766E"/>
     </w:rPr>
   </w:style>
   <w:style w:type="paragraph" w:styleId="Heading2">
     <w:name w:val="heading 2"/>
+    <w:uiPriority w:val="9"/>
+    <w:unhideWhenUsed/>
+    <w:qFormat/>
     <w:pPr>
       <w:spacing w:before="200" w:after="100"/>
+      <w:outlineLvl w:val="1"/>
     </w:pPr>
     <w:rPr>
-      <w:rFonts w:ascii="Calibri" w:hAnsi="Calibri"/>
       <w:b/>
+      <w:color w:val="0F172A"/>
       <w:sz w:val="24"/>
-      <w:color w:val="0F172A"/>
+    </w:rPr>
+  </w:style>
+  <w:style w:type="character" w:default="1" w:styleId="DefaultParagraphFont">
+    <w:name w:val="Default Paragraph Font"/>
+    <w:uiPriority w:val="1"/>
+    <w:semiHidden/>
+    <w:unhideWhenUsed/>
+  </w:style>
+  <w:style w:type="table" w:default="1" w:styleId="TableNormal">
+    <w:name w:val="Normal Table"/>
+    <w:uiPriority w:val="99"/>
+    <w:semiHidden/>
+    <w:unhideWhenUsed/>
+    <w:tblPr>
+      <w:tblInd w:w="0" w:type="dxa"/>
+      <w:tblCellMar>
+        <w:top w:w="0" w:type="dxa"/>
+        <w:left w:w="108" w:type="dxa"/>
+        <w:bottom w:w="0" w:type="dxa"/>
+        <w:right w:w="108" w:type="dxa"/>
+      </w:tblCellMar>
+    </w:tblPr>
+  </w:style>
+  <w:style w:type="numbering" w:default="1" w:styleId="NoList">
+    <w:name w:val="No List"/>
+    <w:uiPriority w:val="99"/>
+    <w:semiHidden/>
+    <w:unhideWhenUsed/>
+  </w:style>
+  <w:style w:type="paragraph" w:styleId="Title">
+    <w:name w:val="Title"/>
+    <w:uiPriority w:val="10"/>
+    <w:qFormat/>
+    <w:rPr>
+      <w:b/>
+      <w:color w:val="042F2E"/>
+      <w:sz w:val="38"/>
     </w:rPr>
   </w:style>
 </w:styles>
+</file>
+
+<file path=word/theme/theme1.xml><?xml version="1.0" encoding="utf-8"?>
+<a:theme xmlns:a="http://schemas.openxmlformats.org/drawingml/2006/main" name="Office Theme">
+  <a:themeElements>
+    <a:clrScheme name="Office">
+      <a:dk1>
+        <a:sysClr val="windowText" lastClr="000000"/>
+      </a:dk1>
+      <a:lt1>
+        <a:sysClr val="window" lastClr="FFFFFF"/>
+      </a:lt1>
+      <a:dk2>
+        <a:srgbClr val="0E2841"/>
+      </a:dk2>
+      <a:lt2>
+        <a:srgbClr val="E8E8E8"/>
+      </a:lt2>
+      <a:accent1>
+        <a:srgbClr val="156082"/>
+      </a:accent1>
+      <a:accent2>
+        <a:srgbClr val="E97132"/>
+      </a:accent2>
+      <a:accent3>
+        <a:srgbClr val="196B24"/>
+      </a:accent3>
+      <a:accent4>
+        <a:srgbClr val="0F9ED5"/>
+      </a:accent4>
+      <a:accent5>
+        <a:srgbClr val="A02B93"/>
+      </a:accent5>
+      <a:accent6>
+        <a:srgbClr val="4EA72E"/>
+      </a:accent6>
+      <a:hlink>
+        <a:srgbClr val="467886"/>
+      </a:hlink>
+      <a:folHlink>
+        <a:srgbClr val="96607D"/>
+      </a:folHlink>
+    </a:clrScheme>
+    <a:fontScheme name="Office">
+      <a:majorFont>
+        <a:latin typeface="Aptos Display" panose="02110004020202020204"/>
+        <a:ea typeface=""/>
+        <a:cs typeface=""/>
+        <a:font script="Jpan" typeface="游ゴシック Light"/>
+        <a:font script="Hang" typeface="맑은 고딕"/>
+        <a:font script="Hans" typeface="等线 Light"/>
+        <a:font script="Hant" typeface="新細明體"/>
+        <a:font script="Arab" typeface="Times New Roman"/>
+        <a:font script="Hebr" typeface="Times New Roman"/>
+        <a:font script="Thai" typeface="Angsana New"/>
+        <a:font script="Ethi" typeface="Nyala"/>
+        <a:font script="Beng" typeface="Vrinda"/>
+        <a:font script="Gujr" typeface="Shruti"/>
+        <a:font script="Khmr" typeface="MoolBoran"/>
+        <a:font script="Knda" typeface="Tunga"/>
+        <a:font script="Guru" typeface="Raavi"/>
+        <a:font script="Cans" typeface="Euphemia"/>
+        <a:font script="Cher" typeface="Plantagenet Cherokee"/>
+        <a:font script="Yiii" typeface="Microsoft Yi Baiti"/>
+        <a:font script="Tibt" typeface="Microsoft Himalaya"/>
+        <a:font script="Thaa" typeface="MV Boli"/>
+        <a:font script="Deva" typeface="Mangal"/>
+        <a:font script="Telu" typeface="Gautami"/>
+        <a:font script="Taml" typeface="Latha"/>
+        <a:font script="Syrc" typeface="Estrangelo Edessa"/>
+        <a:font script="Orya" typeface="Kalinga"/>
+        <a:font script="Mlym" typeface="Kartika"/>
+        <a:font script="Laoo" typeface="DokChampa"/>
+        <a:font script="Sinh" typeface="Iskoola Pota"/>
+        <a:font script="Mong" typeface="Mongolian Baiti"/>
+        <a:font script="Viet" typeface="Times New Roman"/>
+        <a:font script="Uigh" typeface="Microsoft Uighur"/>
+        <a:font script="Geor" typeface="Sylfaen"/>
+        <a:font script="Armn" typeface="Arial"/>
+        <a:font script="Bugi" typeface="Leelawadee UI"/>
+        <a:font script="Bopo" typeface="Microsoft JhengHei"/>
+        <a:font script="Java" typeface="Javanese Text"/>
+        <a:font script="Lisu" typeface="Segoe UI"/>
+        <a:font script="Mymr" typeface="Myanmar Text"/>
+        <a:font script="Nkoo" typeface="Ebrima"/>
+        <a:font script="Olck" typeface="Nirmala UI"/>
+        <a:font script="Osma" typeface="Ebrima"/>
+        <a:font script="Phag" typeface="Phagspa"/>
+        <a:font script="Syrn" typeface="Estrangelo Edessa"/>
+        <a:font script="Syrj" typeface="Estrangelo Edessa"/>
+        <a:font script="Syre" typeface="Estrangelo Edessa"/>
+        <a:font script="Sora" typeface="Nirmala UI"/>
+        <a:font script="Tale" typeface="Microsoft Tai Le"/>
+        <a:font script="Talu" typeface="Microsoft New Tai Lue"/>
+        <a:font script="Tfng" typeface="Ebrima"/>
+      </a:majorFont>
+      <a:minorFont>
+        <a:latin typeface="Aptos" panose="02110004020202020204"/>
+        <a:ea typeface=""/>
+        <a:cs typeface=""/>
+        <a:font script="Jpan" typeface="游明朝"/>
+        <a:font script="Hang" typeface="맑은 고딕"/>
+        <a:font script="Hans" typeface="等线"/>
+        <a:font script="Hant" typeface="新細明體"/>
+        <a:font script="Arab" typeface="Arial"/>
+        <a:font script="Hebr" typeface="Arial"/>
+        <a:font script="Thai" typeface="Cordia New"/>
+        <a:font script="Ethi" typeface="Nyala"/>
+        <a:font script="Beng" typeface="Vrinda"/>
+        <a:font script="Gujr" typeface="Shruti"/>
+        <a:font script="Khmr" typeface="DaunPenh"/>
+        <a:font script="Knda" typeface="Tunga"/>
+        <a:font script="Guru" typeface="Raavi"/>
+        <a:font script="Cans" typeface="Euphemia"/>
+        <a:font script="Cher" typeface="Plantagenet Cherokee"/>
+        <a:font script="Yiii" typeface="Microsoft Yi Baiti"/>
+        <a:font script="Tibt" typeface="Microsoft Himalaya"/>
+        <a:font script="Thaa" typeface="MV Boli"/>
+        <a:font script="Deva" typeface="Mangal"/>
+        <a:font script="Telu" typeface="Gautami"/>
+        <a:font script="Taml" typeface="Latha"/>
+        <a:font script="Syrc" typeface="Estrangelo Edessa"/>
+        <a:font script="Orya" typeface="Kalinga"/>
+        <a:font script="Mlym" typeface="Kartika"/>
+        <a:font script="Laoo" typeface="DokChampa"/>
+        <a:font script="Sinh" typeface="Iskoola Pota"/>
+        <a:font script="Mong" typeface="Mongolian Baiti"/>
+        <a:font script="Viet" typeface="Arial"/>
+        <a:font script="Uigh" typeface="Microsoft Uighur"/>
+        <a:font script="Geor" typeface="Sylfaen"/>
+        <a:font script="Armn" typeface="Arial"/>
+        <a:font script="Bugi" typeface="Leelawadee UI"/>
+        <a:font script="Bopo" typeface="Microsoft JhengHei"/>
+        <a:font script="Java" typeface="Javanese Text"/>
+        <a:font script="Lisu" typeface="Segoe UI"/>
+        <a:font script="Mymr" typeface="Myanmar Text"/>
+        <a:font script="Nkoo" typeface="Ebrima"/>
+        <a:font script="Olck" typeface="Nirmala UI"/>
+        <a:font script="Osma" typeface="Ebrima"/>
+        <a:font script="Phag" typeface="Phagspa"/>
+        <a:font script="Syrn" typeface="Estrangelo Edessa"/>
+        <a:font script="Syrj" typeface="Estrangelo Edessa"/>
+        <a:font script="Syre" typeface="Estrangelo Edessa"/>
+        <a:font script="Sora" typeface="Nirmala UI"/>
+        <a:font script="Tale" typeface="Microsoft Tai Le"/>
+        <a:font script="Talu" typeface="Microsoft New Tai Lue"/>
+        <a:font script="Tfng" typeface="Ebrima"/>
+      </a:minorFont>
+    </a:fontScheme>
+    <a:fmtScheme name="Office">
+      <a:fillStyleLst>
+        <a:solidFill>
+          <a:schemeClr val="phClr"/>
+        </a:solidFill>
+        <a:gradFill rotWithShape="1">
+          <a:gsLst>
+            <a:gs pos="0">
+              <a:schemeClr val="phClr">
+                <a:lumMod val="110000"/>
+                <a:satMod val="105000"/>
+                <a:tint val="67000"/>
+              </a:schemeClr>
+            </a:gs>
+            <a:gs pos="50000">
+              <a:schemeClr val="phClr">
+                <a:lumMod val="105000"/>
+                <a:satMod val="103000"/>
+                <a:tint val="73000"/>
+              </a:schemeClr>
+            </a:gs>
+            <a:gs pos="100000">
+              <a:schemeClr val="phClr">
+                <a:lumMod val="105000"/>
+                <a:satMod val="109000"/>
+                <a:tint val="81000"/>
+              </a:schemeClr>
+            </a:gs>
+          </a:gsLst>
+          <a:lin ang="5400000" scaled="0"/>
+        </a:gradFill>
+        <a:gradFill rotWithShape="1">
+          <a:gsLst>
+            <a:gs pos="0">
+              <a:schemeClr val="phClr">
+                <a:satMod val="103000"/>
+                <a:lumMod val="102000"/>
+                <a:tint val="94000"/>
+              </a:schemeClr>
+            </a:gs>
+            <a:gs pos="50000">
+              <a:schemeClr val="phClr">
+                <a:satMod val="110000"/>
+                <a:lumMod val="100000"/>
+                <a:shade val="100000"/>
+              </a:schemeClr>
+            </a:gs>
+            <a:gs pos="100000">
+              <a:schemeClr val="phClr">
+                <a:lumMod val="99000"/>
+                <a:satMod val="120000"/>
+                <a:shade val="78000"/>
+              </a:schemeClr>
+            </a:gs>
+          </a:gsLst>
+          <a:lin ang="5400000" scaled="0"/>
+        </a:gradFill>
+      </a:fillStyleLst>
+      <a:lnStyleLst>
+        <a:ln w="12700" cap="flat" cmpd="sng" algn="ctr">
+          <a:solidFill>
+            <a:schemeClr val="phClr"/>
+          </a:solidFill>
+          <a:prstDash val="solid"/>
+          <a:miter lim="800000"/>
+        </a:ln>
+        <a:ln w="19050" cap="flat" cmpd="sng" algn="ctr">
+          <a:solidFill>
+            <a:schemeClr val="phClr"/>
+          </a:solidFill>
+          <a:prstDash val="solid"/>
+          <a:miter lim="800000"/>
+        </a:ln>
+        <a:ln w="25400" cap="flat" cmpd="sng" algn="ctr">
+          <a:solidFill>
+            <a:schemeClr val="phClr"/>
+          </a:solidFill>
+          <a:prstDash val="solid"/>
+          <a:miter lim="800000"/>
+        </a:ln>
+      </a:lnStyleLst>
+      <a:effectStyleLst>
+        <a:effectStyle>
+          <a:effectLst/>
+        </a:effectStyle>
+        <a:effectStyle>
+          <a:effectLst/>
+        </a:effectStyle>
+        <a:effectStyle>
+          <a:effectLst>
+            <a:outerShdw blurRad="57150" dist="19050" dir="5400000" algn="ctr" rotWithShape="0">
+              <a:srgbClr val="000000">
+                <a:alpha val="63000"/>
+              </a:srgbClr>
+            </a:outerShdw>
+          </a:effectLst>
+        </a:effectStyle>
+      </a:effectStyleLst>
+      <a:bgFillStyleLst>
+        <a:solidFill>
+          <a:schemeClr val="phClr"/>
+        </a:solidFill>
+        <a:solidFill>
+          <a:schemeClr val="phClr">
+            <a:tint val="95000"/>
+            <a:satMod val="170000"/>
+          </a:schemeClr>
+        </a:solidFill>
+        <a:gradFill rotWithShape="1">
+          <a:gsLst>
+            <a:gs pos="0">
+              <a:schemeClr val="phClr">
+                <a:tint val="93000"/>
+                <a:satMod val="150000"/>
+                <a:shade val="98000"/>
+                <a:lumMod val="102000"/>
+              </a:schemeClr>
+            </a:gs>
+            <a:gs pos="50000">
+              <a:schemeClr val="phClr">
+                <a:tint val="98000"/>
+                <a:satMod val="130000"/>
+                <a:shade val="90000"/>
+                <a:lumMod val="103000"/>
+              </a:schemeClr>
+            </a:gs>
+            <a:gs pos="100000">
+              <a:schemeClr val="phClr">
+                <a:shade val="63000"/>
+                <a:satMod val="120000"/>
+              </a:schemeClr>
+            </a:gs>
+          </a:gsLst>
+          <a:lin ang="5400000" scaled="0"/>
+        </a:gradFill>
+      </a:bgFillStyleLst>
+    </a:fmtScheme>
+  </a:themeElements>
+  <a:objectDefaults>
+    <a:lnDef>
+      <a:spPr/>
+      <a:bodyPr/>
+      <a:lstStyle/>
+      <a:style>
+        <a:lnRef idx="2">
+          <a:schemeClr val="accent1"/>
+        </a:lnRef>
+        <a:fillRef idx="0">
+          <a:schemeClr val="accent1"/>
+        </a:fillRef>
+        <a:effectRef idx="1">
+          <a:schemeClr val="accent1"/>
+        </a:effectRef>
+        <a:fontRef idx="minor">
+          <a:schemeClr val="tx1"/>
+        </a:fontRef>
+      </a:style>
+    </a:lnDef>
+  </a:objectDefaults>
+  <a:extraClrSchemeLst/>
+  <a:extLst>
+    <a:ext uri="{05A4C25C-085E-4340-85A3-A5531E510DB2}">
+      <thm15:themeFamily xmlns:thm15="http://schemas.microsoft.com/office/thememl/2012/main" name="Office Theme" id="{2E142A2C-CD16-42D6-873A-C26D2A0506FA}" vid="{1BDDFF52-6CD6-40A5-AB3C-68EB2F1E4D0A}"/>
+    </a:ext>
+  </a:extLst>
+</a:theme>
 </file>
</xml_diff>